<commit_message>
Actualiza documentacion y coleccion Postman con temporadas, categorias e historicos
</commit_message>
<xml_diff>
--- a/docs/Documentacion-TPO-Liga-Baloncesto.docx
+++ b/docs/Documentacion-TPO-Liga-Baloncesto.docx
@@ -7,7 +7,7 @@
         <w:pBdr>
           <w:bottom w:val="single" w:color="C2470A" w:sz="18" w:space="10"/>
         </w:pBdr>
-        <w:spacing w:after="80" w:before="2200"/>
+        <w:spacing w:after="80" w:before="2000"/>
         <w:jc w:val="center"/>
       </w:pPr>
       <w:r>
@@ -82,7 +82,51 @@
     </w:p>
     <w:p>
       <w:pPr>
-        <w:spacing w:after="0" w:before="1400"/>
+        <w:spacing w:after="0" w:before="900"/>
+        <w:jc w:val="center"/>
+      </w:pPr>
+      <w:r>
+        <w:rPr>
+          <w:b/>
+          <w:bCs/>
+          <w:color w:val="14142B"/>
+          <w:sz w:val="22"/>
+          <w:szCs w:val="22"/>
+        </w:rPr>
+        <w:t xml:space="preserve">Integrantes</w:t>
+      </w:r>
+    </w:p>
+    <w:p>
+      <w:pPr>
+        <w:spacing w:after="0" w:before="40"/>
+        <w:jc w:val="center"/>
+      </w:pPr>
+      <w:r>
+        <w:rPr>
+          <w:color w:val="2B2F3A"/>
+          <w:sz w:val="22"/>
+          <w:szCs w:val="22"/>
+        </w:rPr>
+        <w:t xml:space="preserve">Nombre y Apellido — Legajo: ____________</w:t>
+      </w:r>
+    </w:p>
+    <w:p>
+      <w:pPr>
+        <w:spacing w:after="0" w:before="20"/>
+        <w:jc w:val="center"/>
+      </w:pPr>
+      <w:r>
+        <w:rPr>
+          <w:color w:val="2B2F3A"/>
+          <w:sz w:val="22"/>
+          <w:szCs w:val="22"/>
+        </w:rPr>
+        <w:t xml:space="preserve">Nombre y Apellido — Legajo: ____________</w:t>
+      </w:r>
+    </w:p>
+    <w:p>
+      <w:pPr>
+        <w:spacing w:after="0" w:before="500"/>
         <w:jc w:val="center"/>
       </w:pPr>
       <w:r>
@@ -92,20 +136,6 @@
           <w:szCs w:val="20"/>
         </w:rPr>
         <w:t xml:space="preserve">Stack: React · Node.js · Express · MongoDB</w:t>
-      </w:r>
-    </w:p>
-    <w:p>
-      <w:pPr>
-        <w:spacing w:before="60"/>
-        <w:jc w:val="center"/>
-      </w:pPr>
-      <w:r>
-        <w:rPr>
-          <w:color w:val="6B7280"/>
-          <w:sz w:val="20"/>
-          <w:szCs w:val="20"/>
-        </w:rPr>
-        <w:t xml:space="preserve">Temporada 2026</w:t>
       </w:r>
     </w:p>
     <w:p>
@@ -186,7 +216,7 @@
         <w:rPr>
           <w:color w:val="2B2F3A"/>
         </w:rPr>
-        <w:t xml:space="preserve">La aplicación es un sistema web para la gestión integral de una liga de baloncesto juvenil. Permite administrar equipos, jugadores, partidos y resultados, y calcula de forma automática la tabla de clasificación general del torneo. El sistema ofrece una vista pública de consulta (sin necesidad de iniciar sesión) y un área administrativa protegida para la carga y edición de la información.</w:t>
+        <w:t xml:space="preserve">La aplicación es un sistema web para la gestión integral de una liga de baloncesto juvenil. Permite administrar temporadas, categorías, equipos, jugadores, partidos y resultados, y calcula de forma automática la tabla de clasificación de cada torneo. El sistema ofrece una vista pública de consulta (sin necesidad de iniciar sesión) y un área administrativa protegida para la carga y edición de la información.</w:t>
       </w:r>
     </w:p>
     <w:p>
@@ -207,7 +237,7 @@
         <w:spacing w:after="60"/>
       </w:pPr>
       <w:r>
-        <w:t xml:space="preserve">Centralizar la gestión de equipos, jugadores y partidos de la liga.</w:t>
+        <w:t xml:space="preserve">Centralizar la gestión de temporadas, categorías, equipos, jugadores y partidos.</w:t>
       </w:r>
     </w:p>
     <w:p>
@@ -220,7 +250,7 @@
         <w:spacing w:after="60"/>
       </w:pPr>
       <w:r>
-        <w:t xml:space="preserve">Calcular automáticamente la clasificación aplicando las reglas de puntuación y desempate.</w:t>
+        <w:t xml:space="preserve">Calcular automáticamente la clasificación de cada torneo (temporada + categoría) aplicando las reglas de puntuación y desempate.</w:t>
       </w:r>
     </w:p>
     <w:p>
@@ -267,7 +297,14 @@
         <w:spacing w:after="60"/>
       </w:pPr>
       <w:r>
-        <w:t xml:space="preserve">Vista pública: landing, clasificación, calendario, resultados, listado de equipos y detalle de cada equipo.</w:t>
+        <w:rPr>
+          <w:b/>
+          <w:bCs/>
+        </w:rPr>
+        <w:t xml:space="preserve">Vista pública: </w:t>
+      </w:r>
+      <w:r>
+        <w:t xml:space="preserve">landing, selector de temporada y categoría, clasificación, calendario, resultados, listado de equipos, detalle de cada equipo e históricos / palmarés.</w:t>
       </w:r>
     </w:p>
     <w:p>
@@ -280,7 +317,102 @@
         <w:spacing w:after="60"/>
       </w:pPr>
       <w:r>
-        <w:t xml:space="preserve">Área administrativa: login, ABM de equipos, ABM de jugadores, ABM de partidos y carga de resultados.</w:t>
+        <w:rPr>
+          <w:b/>
+          <w:bCs/>
+        </w:rPr>
+        <w:t xml:space="preserve">Área administrativa: </w:t>
+      </w:r>
+      <w:r>
+        <w:t xml:space="preserve">login, gestión de temporadas, categorías, equipos (con escudo), jugadores, partidos y carga de resultados.</w:t>
+      </w:r>
+    </w:p>
+    <w:p>
+      <w:pPr>
+        <w:pStyle w:val="Heading2"/>
+      </w:pPr>
+      <w:r>
+        <w:t xml:space="preserve">1.4 Funcionalidades destacadas</w:t>
+      </w:r>
+    </w:p>
+    <w:p>
+      <w:pPr>
+        <w:pStyle w:val="ListParagraph"/>
+        <w:numPr>
+          <w:ilvl w:val="0"/>
+          <w:numId w:val="2"/>
+        </w:numPr>
+        <w:spacing w:after="60"/>
+      </w:pPr>
+      <w:r>
+        <w:rPr>
+          <w:b/>
+          <w:bCs/>
+        </w:rPr>
+        <w:t xml:space="preserve">Temporadas: </w:t>
+      </w:r>
+      <w:r>
+        <w:t xml:space="preserve">cada temporada (año) tiene su propia clasificación, calendario y resultados, con un selector para cambiar de año.</w:t>
+      </w:r>
+    </w:p>
+    <w:p>
+      <w:pPr>
+        <w:pStyle w:val="ListParagraph"/>
+        <w:numPr>
+          <w:ilvl w:val="0"/>
+          <w:numId w:val="2"/>
+        </w:numPr>
+        <w:spacing w:after="60"/>
+      </w:pPr>
+      <w:r>
+        <w:rPr>
+          <w:b/>
+          <w:bCs/>
+        </w:rPr>
+        <w:t xml:space="preserve">Categorías como torneos: </w:t>
+      </w:r>
+      <w:r>
+        <w:t xml:space="preserve">cada categoría (U13, U15, U17...) es un torneo independiente con su propia tabla.</w:t>
+      </w:r>
+    </w:p>
+    <w:p>
+      <w:pPr>
+        <w:pStyle w:val="ListParagraph"/>
+        <w:numPr>
+          <w:ilvl w:val="0"/>
+          <w:numId w:val="2"/>
+        </w:numPr>
+        <w:spacing w:after="60"/>
+      </w:pPr>
+      <w:r>
+        <w:rPr>
+          <w:b/>
+          <w:bCs/>
+        </w:rPr>
+        <w:t xml:space="preserve">Históricos / palmarés: </w:t>
+      </w:r>
+      <w:r>
+        <w:t xml:space="preserve">campeón de cada temporada y categoría, y conteo de títulos por equipo.</w:t>
+      </w:r>
+    </w:p>
+    <w:p>
+      <w:pPr>
+        <w:pStyle w:val="ListParagraph"/>
+        <w:numPr>
+          <w:ilvl w:val="0"/>
+          <w:numId w:val="2"/>
+        </w:numPr>
+        <w:spacing w:after="60"/>
+      </w:pPr>
+      <w:r>
+        <w:rPr>
+          <w:b/>
+          <w:bCs/>
+        </w:rPr>
+        <w:t xml:space="preserve">Escudo de equipos: </w:t>
+      </w:r>
+      <w:r>
+        <w:t xml:space="preserve">cada equipo puede tener una imagen / escudo; si no, se muestra un avatar con las iniciales.</w:t>
       </w:r>
     </w:p>
     <w:p>
@@ -624,7 +756,7 @@
                 <w:sz w:val="19"/>
                 <w:szCs w:val="19"/>
               </w:rPr>
-              <w:t xml:space="preserve">Almacenamiento de administradores, equipos, jugadores y partidos.</w:t>
+              <w:t xml:space="preserve">Almacenamiento de temporadas, categorías, equipos, jugadores y partidos.</w:t>
             </w:r>
           </w:p>
         </w:tc>
@@ -725,7 +857,7 @@
         <w:t xml:space="preserve">Services: </w:t>
       </w:r>
       <w:r>
-        <w:t xml:space="preserve">concentran la lógica de negocio (por ejemplo, el cálculo de la clasificación).</w:t>
+        <w:t xml:space="preserve">concentran la lógica de negocio (cálculo de clasificación, detalle de equipo, históricos).</w:t>
       </w:r>
     </w:p>
     <w:p>
@@ -1131,6 +1263,23 @@
           <w:sz w:val="19"/>
           <w:szCs w:val="19"/>
         </w:rPr>
+        <w:t xml:space="preserve">├── docs/       Documentación</w:t>
+      </w:r>
+    </w:p>
+    <w:p>
+      <w:pPr>
+        <w:pBdr>
+          <w:left w:val="single" w:color="C2470A" w:sz="18" w:space="8"/>
+        </w:pBdr>
+        <w:shd w:fill="F4F5F7" w:val="clear"/>
+        <w:spacing w:after="40"/>
+      </w:pPr>
+      <w:r>
+        <w:rPr>
+          <w:rFonts w:ascii="Consolas" w:cs="Consolas" w:eastAsia="Consolas" w:hAnsi="Consolas"/>
+          <w:sz w:val="19"/>
+          <w:szCs w:val="19"/>
+        </w:rPr>
         <w:t xml:space="preserve">└── postman/    Colección de prueba de la API</w:t>
       </w:r>
     </w:p>
@@ -1165,7 +1314,7 @@
         <w:spacing w:after="60"/>
       </w:pPr>
       <w:r>
-        <w:t xml:space="preserve">models/ — esquemas Mongoose: Admin, Team, Player, Match.</w:t>
+        <w:t xml:space="preserve">models/ — esquemas Mongoose: Admin, Season, Category, Team, Player, Match.</w:t>
       </w:r>
     </w:p>
     <w:p>
@@ -1204,7 +1353,7 @@
         <w:spacing w:after="60"/>
       </w:pPr>
       <w:r>
-        <w:t xml:space="preserve">services/ — lógica de negocio (cálculo de clasificación y detalle de equipo).</w:t>
+        <w:t xml:space="preserve">services/ — lógica de negocio (clasificación por torneo, detalle de equipo, históricos).</w:t>
       </w:r>
     </w:p>
     <w:p>
@@ -1230,7 +1379,7 @@
         <w:spacing w:after="60"/>
       </w:pPr>
       <w:r>
-        <w:t xml:space="preserve">utils/ — utilidades (JWT, serialización, semilla de datos y administrador inicial).</w:t>
+        <w:t xml:space="preserve">utils/ — utilidades (JWT, serialización, temporada activa, semilla de datos).</w:t>
       </w:r>
     </w:p>
     <w:p>
@@ -1264,7 +1413,7 @@
         <w:spacing w:after="60"/>
       </w:pPr>
       <w:r>
-        <w:t xml:space="preserve">context/ — estado de sesión (AuthContext).</w:t>
+        <w:t xml:space="preserve">context/ — estado de sesión (AuthContext) y de torneo seleccionado (LeagueContext: temporada + categoría).</w:t>
       </w:r>
     </w:p>
     <w:p>
@@ -1290,7 +1439,7 @@
         <w:spacing w:after="60"/>
       </w:pPr>
       <w:r>
-        <w:t xml:space="preserve">components/ — componentes reutilizables (layout, UI y formularios del ABM).</w:t>
+        <w:t xml:space="preserve">components/ — componentes reutilizables (layout, UI, escudo de equipo y formularios del ABM).</w:t>
       </w:r>
     </w:p>
     <w:p>
@@ -1303,7 +1452,7 @@
         <w:spacing w:after="60"/>
       </w:pPr>
       <w:r>
-        <w:t xml:space="preserve">pages/ — vistas públicas y vistas del área administrativa.</w:t>
+        <w:t xml:space="preserve">pages/ — vistas públicas (incluye históricos) y vistas del área administrativa.</w:t>
       </w:r>
     </w:p>
     <w:p>
@@ -1335,7 +1484,7 @@
         <w:rPr>
           <w:color w:val="2B2F3A"/>
         </w:rPr>
-        <w:t xml:space="preserve">La base utiliza cuatro colecciones principales. Los partidos y jugadores referencian a los equipos por su identificador.</w:t>
+        <w:t xml:space="preserve">La base utiliza las siguientes colecciones. Los partidos referencian a su temporada y se etiquetan con una categoría; los jugadores referencian a su equipo y tienen una categoría.</w:t>
       </w:r>
     </w:p>
     <w:p>
@@ -1359,9 +1508,9 @@
         </w:tblBorders>
       </w:tblPr>
       <w:tblGrid>
-        <w:gridCol w:w="2400"/>
-        <w:gridCol w:w="2000"/>
-        <w:gridCol w:w="4960"/>
+        <w:gridCol w:w="2600"/>
+        <w:gridCol w:w="2200"/>
+        <w:gridCol w:w="4560"/>
       </w:tblGrid>
       <w:tr>
         <w:trPr>
@@ -1369,7 +1518,7 @@
         </w:trPr>
         <w:tc>
           <w:tcPr>
-            <w:tcW w:type="dxa" w:w="2400"/>
+            <w:tcW w:type="dxa" w:w="2600"/>
             <w:shd w:fill="14142B" w:val="clear"/>
             <w:tcMar>
               <w:top w:type="dxa" w:w="60"/>
@@ -1394,7 +1543,7 @@
         </w:tc>
         <w:tc>
           <w:tcPr>
-            <w:tcW w:type="dxa" w:w="2000"/>
+            <w:tcW w:type="dxa" w:w="2200"/>
             <w:shd w:fill="14142B" w:val="clear"/>
             <w:tcMar>
               <w:top w:type="dxa" w:w="60"/>
@@ -1419,7 +1568,7 @@
         </w:tc>
         <w:tc>
           <w:tcPr>
-            <w:tcW w:type="dxa" w:w="4960"/>
+            <w:tcW w:type="dxa" w:w="4560"/>
             <w:shd w:fill="14142B" w:val="clear"/>
             <w:tcMar>
               <w:top w:type="dxa" w:w="60"/>
@@ -1446,7 +1595,7 @@
       <w:tr>
         <w:tc>
           <w:tcPr>
-            <w:tcW w:type="dxa" w:w="2400"/>
+            <w:tcW w:type="dxa" w:w="2600"/>
             <w:shd w:fill="FFFFFF" w:val="clear"/>
             <w:tcMar>
               <w:top w:type="dxa" w:w="60"/>
@@ -1470,7 +1619,7 @@
         </w:tc>
         <w:tc>
           <w:tcPr>
-            <w:tcW w:type="dxa" w:w="2000"/>
+            <w:tcW w:type="dxa" w:w="2200"/>
             <w:shd w:fill="FFFFFF" w:val="clear"/>
             <w:tcMar>
               <w:top w:type="dxa" w:w="60"/>
@@ -1494,7 +1643,7 @@
         </w:tc>
         <w:tc>
           <w:tcPr>
-            <w:tcW w:type="dxa" w:w="4960"/>
+            <w:tcW w:type="dxa" w:w="4560"/>
             <w:shd w:fill="FFFFFF" w:val="clear"/>
             <w:tcMar>
               <w:top w:type="dxa" w:w="60"/>
@@ -1520,7 +1669,7 @@
       <w:tr>
         <w:tc>
           <w:tcPr>
-            <w:tcW w:type="dxa" w:w="2400"/>
+            <w:tcW w:type="dxa" w:w="2600"/>
             <w:shd w:fill="F7F8FA" w:val="clear"/>
             <w:tcMar>
               <w:top w:type="dxa" w:w="60"/>
@@ -1544,7 +1693,7 @@
         </w:tc>
         <w:tc>
           <w:tcPr>
-            <w:tcW w:type="dxa" w:w="2000"/>
+            <w:tcW w:type="dxa" w:w="2200"/>
             <w:shd w:fill="F7F8FA" w:val="clear"/>
             <w:tcMar>
               <w:top w:type="dxa" w:w="60"/>
@@ -1568,7 +1717,7 @@
         </w:tc>
         <w:tc>
           <w:tcPr>
-            <w:tcW w:type="dxa" w:w="4960"/>
+            <w:tcW w:type="dxa" w:w="4560"/>
             <w:shd w:fill="F7F8FA" w:val="clear"/>
             <w:tcMar>
               <w:top w:type="dxa" w:w="60"/>
@@ -1605,7 +1754,7 @@
         <w:pStyle w:val="Heading2"/>
       </w:pPr>
       <w:r>
-        <w:t xml:space="preserve">5.2 Equipo (Team)</w:t>
+        <w:t xml:space="preserve">5.2 Temporada (Season)</w:t>
       </w:r>
     </w:p>
     <w:tbl>
@@ -1621,9 +1770,9 @@
         </w:tblBorders>
       </w:tblPr>
       <w:tblGrid>
-        <w:gridCol w:w="2400"/>
-        <w:gridCol w:w="2000"/>
-        <w:gridCol w:w="4960"/>
+        <w:gridCol w:w="2600"/>
+        <w:gridCol w:w="2200"/>
+        <w:gridCol w:w="4560"/>
       </w:tblGrid>
       <w:tr>
         <w:trPr>
@@ -1631,7 +1780,7 @@
         </w:trPr>
         <w:tc>
           <w:tcPr>
-            <w:tcW w:type="dxa" w:w="2400"/>
+            <w:tcW w:type="dxa" w:w="2600"/>
             <w:shd w:fill="14142B" w:val="clear"/>
             <w:tcMar>
               <w:top w:type="dxa" w:w="60"/>
@@ -1656,7 +1805,7 @@
         </w:tc>
         <w:tc>
           <w:tcPr>
-            <w:tcW w:type="dxa" w:w="2000"/>
+            <w:tcW w:type="dxa" w:w="2200"/>
             <w:shd w:fill="14142B" w:val="clear"/>
             <w:tcMar>
               <w:top w:type="dxa" w:w="60"/>
@@ -1681,7 +1830,7 @@
         </w:tc>
         <w:tc>
           <w:tcPr>
-            <w:tcW w:type="dxa" w:w="4960"/>
+            <w:tcW w:type="dxa" w:w="4560"/>
             <w:shd w:fill="14142B" w:val="clear"/>
             <w:tcMar>
               <w:top w:type="dxa" w:w="60"/>
@@ -1708,7 +1857,7 @@
       <w:tr>
         <w:tc>
           <w:tcPr>
-            <w:tcW w:type="dxa" w:w="2400"/>
+            <w:tcW w:type="dxa" w:w="2600"/>
             <w:shd w:fill="FFFFFF" w:val="clear"/>
             <w:tcMar>
               <w:top w:type="dxa" w:w="60"/>
@@ -1732,7 +1881,7 @@
         </w:tc>
         <w:tc>
           <w:tcPr>
-            <w:tcW w:type="dxa" w:w="2000"/>
+            <w:tcW w:type="dxa" w:w="2200"/>
             <w:shd w:fill="FFFFFF" w:val="clear"/>
             <w:tcMar>
               <w:top w:type="dxa" w:w="60"/>
@@ -1756,25 +1905,25 @@
         </w:tc>
         <w:tc>
           <w:tcPr>
-            <w:tcW w:type="dxa" w:w="4960"/>
-            <w:shd w:fill="FFFFFF" w:val="clear"/>
-            <w:tcMar>
-              <w:top w:type="dxa" w:w="60"/>
-              <w:left w:type="dxa" w:w="110"/>
-              <w:bottom w:type="dxa" w:w="60"/>
-              <w:right w:type="dxa" w:w="110"/>
-            </w:tcMar>
-            <w:vAlign w:val="center"/>
-          </w:tcPr>
-          <w:p>
-            <w:r>
-              <w:rPr>
-                <w:b w:val="false"/>
-                <w:bCs w:val="false"/>
-                <w:sz w:val="19"/>
-                <w:szCs w:val="19"/>
-              </w:rPr>
-              <w:t xml:space="preserve">Nombre del equipo (único).</w:t>
+            <w:tcW w:type="dxa" w:w="4560"/>
+            <w:shd w:fill="FFFFFF" w:val="clear"/>
+            <w:tcMar>
+              <w:top w:type="dxa" w:w="60"/>
+              <w:left w:type="dxa" w:w="110"/>
+              <w:bottom w:type="dxa" w:w="60"/>
+              <w:right w:type="dxa" w:w="110"/>
+            </w:tcMar>
+            <w:vAlign w:val="center"/>
+          </w:tcPr>
+          <w:p>
+            <w:r>
+              <w:rPr>
+                <w:b w:val="false"/>
+                <w:bCs w:val="false"/>
+                <w:sz w:val="19"/>
+                <w:szCs w:val="19"/>
+              </w:rPr>
+              <w:t xml:space="preserve">Nombre (ej. Temporada 2026).</w:t>
             </w:r>
           </w:p>
         </w:tc>
@@ -1782,7 +1931,7 @@
       <w:tr>
         <w:tc>
           <w:tcPr>
-            <w:tcW w:type="dxa" w:w="2400"/>
+            <w:tcW w:type="dxa" w:w="2600"/>
             <w:shd w:fill="F7F8FA" w:val="clear"/>
             <w:tcMar>
               <w:top w:type="dxa" w:w="60"/>
@@ -1800,13 +1949,13 @@
                 <w:sz w:val="19"/>
                 <w:szCs w:val="19"/>
               </w:rPr>
-              <w:t xml:space="preserve">coachName</w:t>
-            </w:r>
-          </w:p>
-        </w:tc>
-        <w:tc>
-          <w:tcPr>
-            <w:tcW w:type="dxa" w:w="2000"/>
+              <w:t xml:space="preserve">year</w:t>
+            </w:r>
+          </w:p>
+        </w:tc>
+        <w:tc>
+          <w:tcPr>
+            <w:tcW w:type="dxa" w:w="2200"/>
             <w:shd w:fill="F7F8FA" w:val="clear"/>
             <w:tcMar>
               <w:top w:type="dxa" w:w="60"/>
@@ -1824,13 +1973,13 @@
                 <w:sz w:val="19"/>
                 <w:szCs w:val="19"/>
               </w:rPr>
-              <w:t xml:space="preserve">String</w:t>
-            </w:r>
-          </w:p>
-        </w:tc>
-        <w:tc>
-          <w:tcPr>
-            <w:tcW w:type="dxa" w:w="4960"/>
+              <w:t xml:space="preserve">Number</w:t>
+            </w:r>
+          </w:p>
+        </w:tc>
+        <w:tc>
+          <w:tcPr>
+            <w:tcW w:type="dxa" w:w="4560"/>
             <w:shd w:fill="F7F8FA" w:val="clear"/>
             <w:tcMar>
               <w:top w:type="dxa" w:w="60"/>
@@ -1848,7 +1997,81 @@
                 <w:sz w:val="19"/>
                 <w:szCs w:val="19"/>
               </w:rPr>
-              <w:t xml:space="preserve">Nombre del entrenador/a.</w:t>
+              <w:t xml:space="preserve">Año de la temporada.</w:t>
+            </w:r>
+          </w:p>
+        </w:tc>
+      </w:tr>
+      <w:tr>
+        <w:tc>
+          <w:tcPr>
+            <w:tcW w:type="dxa" w:w="2600"/>
+            <w:shd w:fill="FFFFFF" w:val="clear"/>
+            <w:tcMar>
+              <w:top w:type="dxa" w:w="60"/>
+              <w:left w:type="dxa" w:w="110"/>
+              <w:bottom w:type="dxa" w:w="60"/>
+              <w:right w:type="dxa" w:w="110"/>
+            </w:tcMar>
+            <w:vAlign w:val="center"/>
+          </w:tcPr>
+          <w:p>
+            <w:r>
+              <w:rPr>
+                <w:b w:val="false"/>
+                <w:bCs w:val="false"/>
+                <w:sz w:val="19"/>
+                <w:szCs w:val="19"/>
+              </w:rPr>
+              <w:t xml:space="preserve">isActive</w:t>
+            </w:r>
+          </w:p>
+        </w:tc>
+        <w:tc>
+          <w:tcPr>
+            <w:tcW w:type="dxa" w:w="2200"/>
+            <w:shd w:fill="FFFFFF" w:val="clear"/>
+            <w:tcMar>
+              <w:top w:type="dxa" w:w="60"/>
+              <w:left w:type="dxa" w:w="110"/>
+              <w:bottom w:type="dxa" w:w="60"/>
+              <w:right w:type="dxa" w:w="110"/>
+            </w:tcMar>
+            <w:vAlign w:val="center"/>
+          </w:tcPr>
+          <w:p>
+            <w:r>
+              <w:rPr>
+                <w:b w:val="false"/>
+                <w:bCs w:val="false"/>
+                <w:sz w:val="19"/>
+                <w:szCs w:val="19"/>
+              </w:rPr>
+              <w:t xml:space="preserve">Boolean</w:t>
+            </w:r>
+          </w:p>
+        </w:tc>
+        <w:tc>
+          <w:tcPr>
+            <w:tcW w:type="dxa" w:w="4560"/>
+            <w:shd w:fill="FFFFFF" w:val="clear"/>
+            <w:tcMar>
+              <w:top w:type="dxa" w:w="60"/>
+              <w:left w:type="dxa" w:w="110"/>
+              <w:bottom w:type="dxa" w:w="60"/>
+              <w:right w:type="dxa" w:w="110"/>
+            </w:tcMar>
+            <w:vAlign w:val="center"/>
+          </w:tcPr>
+          <w:p>
+            <w:r>
+              <w:rPr>
+                <w:b w:val="false"/>
+                <w:bCs w:val="false"/>
+                <w:sz w:val="19"/>
+                <w:szCs w:val="19"/>
+              </w:rPr>
+              <w:t xml:space="preserve">Indica la temporada activa (se muestra por defecto).</w:t>
             </w:r>
           </w:p>
         </w:tc>
@@ -1867,7 +2090,7 @@
         <w:pStyle w:val="Heading2"/>
       </w:pPr>
       <w:r>
-        <w:t xml:space="preserve">5.3 Jugador (Player)</w:t>
+        <w:t xml:space="preserve">5.3 Categoría (Category)</w:t>
       </w:r>
     </w:p>
     <w:tbl>
@@ -1883,9 +2106,9 @@
         </w:tblBorders>
       </w:tblPr>
       <w:tblGrid>
-        <w:gridCol w:w="2400"/>
-        <w:gridCol w:w="2000"/>
-        <w:gridCol w:w="4960"/>
+        <w:gridCol w:w="2600"/>
+        <w:gridCol w:w="2200"/>
+        <w:gridCol w:w="4560"/>
       </w:tblGrid>
       <w:tr>
         <w:trPr>
@@ -1893,7 +2116,7 @@
         </w:trPr>
         <w:tc>
           <w:tcPr>
-            <w:tcW w:type="dxa" w:w="2400"/>
+            <w:tcW w:type="dxa" w:w="2600"/>
             <w:shd w:fill="14142B" w:val="clear"/>
             <w:tcMar>
               <w:top w:type="dxa" w:w="60"/>
@@ -1918,7 +2141,7 @@
         </w:tc>
         <w:tc>
           <w:tcPr>
-            <w:tcW w:type="dxa" w:w="2000"/>
+            <w:tcW w:type="dxa" w:w="2200"/>
             <w:shd w:fill="14142B" w:val="clear"/>
             <w:tcMar>
               <w:top w:type="dxa" w:w="60"/>
@@ -1943,7 +2166,7 @@
         </w:tc>
         <w:tc>
           <w:tcPr>
-            <w:tcW w:type="dxa" w:w="4960"/>
+            <w:tcW w:type="dxa" w:w="4560"/>
             <w:shd w:fill="14142B" w:val="clear"/>
             <w:tcMar>
               <w:top w:type="dxa" w:w="60"/>
@@ -1970,31 +2193,31 @@
       <w:tr>
         <w:tc>
           <w:tcPr>
-            <w:tcW w:type="dxa" w:w="2400"/>
-            <w:shd w:fill="FFFFFF" w:val="clear"/>
-            <w:tcMar>
-              <w:top w:type="dxa" w:w="60"/>
-              <w:left w:type="dxa" w:w="110"/>
-              <w:bottom w:type="dxa" w:w="60"/>
-              <w:right w:type="dxa" w:w="110"/>
-            </w:tcMar>
-            <w:vAlign w:val="center"/>
-          </w:tcPr>
-          <w:p>
-            <w:r>
-              <w:rPr>
-                <w:b w:val="false"/>
-                <w:bCs w:val="false"/>
-                <w:sz w:val="19"/>
-                <w:szCs w:val="19"/>
-              </w:rPr>
-              <w:t xml:space="preserve">firstName</w:t>
-            </w:r>
-          </w:p>
-        </w:tc>
-        <w:tc>
-          <w:tcPr>
-            <w:tcW w:type="dxa" w:w="2000"/>
+            <w:tcW w:type="dxa" w:w="2600"/>
+            <w:shd w:fill="FFFFFF" w:val="clear"/>
+            <w:tcMar>
+              <w:top w:type="dxa" w:w="60"/>
+              <w:left w:type="dxa" w:w="110"/>
+              <w:bottom w:type="dxa" w:w="60"/>
+              <w:right w:type="dxa" w:w="110"/>
+            </w:tcMar>
+            <w:vAlign w:val="center"/>
+          </w:tcPr>
+          <w:p>
+            <w:r>
+              <w:rPr>
+                <w:b w:val="false"/>
+                <w:bCs w:val="false"/>
+                <w:sz w:val="19"/>
+                <w:szCs w:val="19"/>
+              </w:rPr>
+              <w:t xml:space="preserve">name</w:t>
+            </w:r>
+          </w:p>
+        </w:tc>
+        <w:tc>
+          <w:tcPr>
+            <w:tcW w:type="dxa" w:w="2200"/>
             <w:shd w:fill="FFFFFF" w:val="clear"/>
             <w:tcMar>
               <w:top w:type="dxa" w:w="60"/>
@@ -2018,25 +2241,25 @@
         </w:tc>
         <w:tc>
           <w:tcPr>
-            <w:tcW w:type="dxa" w:w="4960"/>
-            <w:shd w:fill="FFFFFF" w:val="clear"/>
-            <w:tcMar>
-              <w:top w:type="dxa" w:w="60"/>
-              <w:left w:type="dxa" w:w="110"/>
-              <w:bottom w:type="dxa" w:w="60"/>
-              <w:right w:type="dxa" w:w="110"/>
-            </w:tcMar>
-            <w:vAlign w:val="center"/>
-          </w:tcPr>
-          <w:p>
-            <w:r>
-              <w:rPr>
-                <w:b w:val="false"/>
-                <w:bCs w:val="false"/>
-                <w:sz w:val="19"/>
-                <w:szCs w:val="19"/>
-              </w:rPr>
-              <w:t xml:space="preserve">Nombre del jugador.</w:t>
+            <w:tcW w:type="dxa" w:w="4560"/>
+            <w:shd w:fill="FFFFFF" w:val="clear"/>
+            <w:tcMar>
+              <w:top w:type="dxa" w:w="60"/>
+              <w:left w:type="dxa" w:w="110"/>
+              <w:bottom w:type="dxa" w:w="60"/>
+              <w:right w:type="dxa" w:w="110"/>
+            </w:tcMar>
+            <w:vAlign w:val="center"/>
+          </w:tcPr>
+          <w:p>
+            <w:r>
+              <w:rPr>
+                <w:b w:val="false"/>
+                <w:bCs w:val="false"/>
+                <w:sz w:val="19"/>
+                <w:szCs w:val="19"/>
+              </w:rPr>
+              <w:t xml:space="preserve">Nombre de la categoría (ej. U17).</w:t>
             </w:r>
           </w:p>
         </w:tc>
@@ -2044,7 +2267,7 @@
       <w:tr>
         <w:tc>
           <w:tcPr>
-            <w:tcW w:type="dxa" w:w="2400"/>
+            <w:tcW w:type="dxa" w:w="2600"/>
             <w:shd w:fill="F7F8FA" w:val="clear"/>
             <w:tcMar>
               <w:top w:type="dxa" w:w="60"/>
@@ -2062,13 +2285,13 @@
                 <w:sz w:val="19"/>
                 <w:szCs w:val="19"/>
               </w:rPr>
-              <w:t xml:space="preserve">lastName</w:t>
-            </w:r>
-          </w:p>
-        </w:tc>
-        <w:tc>
-          <w:tcPr>
-            <w:tcW w:type="dxa" w:w="2000"/>
+              <w:t xml:space="preserve">order</w:t>
+            </w:r>
+          </w:p>
+        </w:tc>
+        <w:tc>
+          <w:tcPr>
+            <w:tcW w:type="dxa" w:w="2200"/>
             <w:shd w:fill="F7F8FA" w:val="clear"/>
             <w:tcMar>
               <w:top w:type="dxa" w:w="60"/>
@@ -2086,13 +2309,13 @@
                 <w:sz w:val="19"/>
                 <w:szCs w:val="19"/>
               </w:rPr>
-              <w:t xml:space="preserve">String</w:t>
-            </w:r>
-          </w:p>
-        </w:tc>
-        <w:tc>
-          <w:tcPr>
-            <w:tcW w:type="dxa" w:w="4960"/>
+              <w:t xml:space="preserve">Number</w:t>
+            </w:r>
+          </w:p>
+        </w:tc>
+        <w:tc>
+          <w:tcPr>
+            <w:tcW w:type="dxa" w:w="4560"/>
             <w:shd w:fill="F7F8FA" w:val="clear"/>
             <w:tcMar>
               <w:top w:type="dxa" w:w="60"/>
@@ -2110,155 +2333,7 @@
                 <w:sz w:val="19"/>
                 <w:szCs w:val="19"/>
               </w:rPr>
-              <w:t xml:space="preserve">Apellido del jugador.</w:t>
-            </w:r>
-          </w:p>
-        </w:tc>
-      </w:tr>
-      <w:tr>
-        <w:tc>
-          <w:tcPr>
-            <w:tcW w:type="dxa" w:w="2400"/>
-            <w:shd w:fill="FFFFFF" w:val="clear"/>
-            <w:tcMar>
-              <w:top w:type="dxa" w:w="60"/>
-              <w:left w:type="dxa" w:w="110"/>
-              <w:bottom w:type="dxa" w:w="60"/>
-              <w:right w:type="dxa" w:w="110"/>
-            </w:tcMar>
-            <w:vAlign w:val="center"/>
-          </w:tcPr>
-          <w:p>
-            <w:r>
-              <w:rPr>
-                <w:b w:val="false"/>
-                <w:bCs w:val="false"/>
-                <w:sz w:val="19"/>
-                <w:szCs w:val="19"/>
-              </w:rPr>
-              <w:t xml:space="preserve">category</w:t>
-            </w:r>
-          </w:p>
-        </w:tc>
-        <w:tc>
-          <w:tcPr>
-            <w:tcW w:type="dxa" w:w="2000"/>
-            <w:shd w:fill="FFFFFF" w:val="clear"/>
-            <w:tcMar>
-              <w:top w:type="dxa" w:w="60"/>
-              <w:left w:type="dxa" w:w="110"/>
-              <w:bottom w:type="dxa" w:w="60"/>
-              <w:right w:type="dxa" w:w="110"/>
-            </w:tcMar>
-            <w:vAlign w:val="center"/>
-          </w:tcPr>
-          <w:p>
-            <w:r>
-              <w:rPr>
-                <w:b w:val="false"/>
-                <w:bCs w:val="false"/>
-                <w:sz w:val="19"/>
-                <w:szCs w:val="19"/>
-              </w:rPr>
-              <w:t xml:space="preserve">String</w:t>
-            </w:r>
-          </w:p>
-        </w:tc>
-        <w:tc>
-          <w:tcPr>
-            <w:tcW w:type="dxa" w:w="4960"/>
-            <w:shd w:fill="FFFFFF" w:val="clear"/>
-            <w:tcMar>
-              <w:top w:type="dxa" w:w="60"/>
-              <w:left w:type="dxa" w:w="110"/>
-              <w:bottom w:type="dxa" w:w="60"/>
-              <w:right w:type="dxa" w:w="110"/>
-            </w:tcMar>
-            <w:vAlign w:val="center"/>
-          </w:tcPr>
-          <w:p>
-            <w:r>
-              <w:rPr>
-                <w:b w:val="false"/>
-                <w:bCs w:val="false"/>
-                <w:sz w:val="19"/>
-                <w:szCs w:val="19"/>
-              </w:rPr>
-              <w:t xml:space="preserve">Categoría (ej. U13, U15, U17).</w:t>
-            </w:r>
-          </w:p>
-        </w:tc>
-      </w:tr>
-      <w:tr>
-        <w:tc>
-          <w:tcPr>
-            <w:tcW w:type="dxa" w:w="2400"/>
-            <w:shd w:fill="F7F8FA" w:val="clear"/>
-            <w:tcMar>
-              <w:top w:type="dxa" w:w="60"/>
-              <w:left w:type="dxa" w:w="110"/>
-              <w:bottom w:type="dxa" w:w="60"/>
-              <w:right w:type="dxa" w:w="110"/>
-            </w:tcMar>
-            <w:vAlign w:val="center"/>
-          </w:tcPr>
-          <w:p>
-            <w:r>
-              <w:rPr>
-                <w:b w:val="false"/>
-                <w:bCs w:val="false"/>
-                <w:sz w:val="19"/>
-                <w:szCs w:val="19"/>
-              </w:rPr>
-              <w:t xml:space="preserve">team</w:t>
-            </w:r>
-          </w:p>
-        </w:tc>
-        <w:tc>
-          <w:tcPr>
-            <w:tcW w:type="dxa" w:w="2000"/>
-            <w:shd w:fill="F7F8FA" w:val="clear"/>
-            <w:tcMar>
-              <w:top w:type="dxa" w:w="60"/>
-              <w:left w:type="dxa" w:w="110"/>
-              <w:bottom w:type="dxa" w:w="60"/>
-              <w:right w:type="dxa" w:w="110"/>
-            </w:tcMar>
-            <w:vAlign w:val="center"/>
-          </w:tcPr>
-          <w:p>
-            <w:r>
-              <w:rPr>
-                <w:b w:val="false"/>
-                <w:bCs w:val="false"/>
-                <w:sz w:val="19"/>
-                <w:szCs w:val="19"/>
-              </w:rPr>
-              <w:t xml:space="preserve">ObjectId → Team</w:t>
-            </w:r>
-          </w:p>
-        </w:tc>
-        <w:tc>
-          <w:tcPr>
-            <w:tcW w:type="dxa" w:w="4960"/>
-            <w:shd w:fill="F7F8FA" w:val="clear"/>
-            <w:tcMar>
-              <w:top w:type="dxa" w:w="60"/>
-              <w:left w:type="dxa" w:w="110"/>
-              <w:bottom w:type="dxa" w:w="60"/>
-              <w:right w:type="dxa" w:w="110"/>
-            </w:tcMar>
-            <w:vAlign w:val="center"/>
-          </w:tcPr>
-          <w:p>
-            <w:r>
-              <w:rPr>
-                <w:b w:val="false"/>
-                <w:bCs w:val="false"/>
-                <w:sz w:val="19"/>
-                <w:szCs w:val="19"/>
-              </w:rPr>
-              <w:t xml:space="preserve">Equipo al que pertenece.</w:t>
+              <w:t xml:space="preserve">Orden para listar las categorías.</w:t>
             </w:r>
           </w:p>
         </w:tc>
@@ -2277,7 +2352,7 @@
         <w:pStyle w:val="Heading2"/>
       </w:pPr>
       <w:r>
-        <w:t xml:space="preserve">5.4 Partido (Match)</w:t>
+        <w:t xml:space="preserve">5.4 Equipo (Team)</w:t>
       </w:r>
     </w:p>
     <w:tbl>
@@ -2293,9 +2368,9 @@
         </w:tblBorders>
       </w:tblPr>
       <w:tblGrid>
-        <w:gridCol w:w="2400"/>
-        <w:gridCol w:w="2000"/>
-        <w:gridCol w:w="4960"/>
+        <w:gridCol w:w="2600"/>
+        <w:gridCol w:w="2200"/>
+        <w:gridCol w:w="4560"/>
       </w:tblGrid>
       <w:tr>
         <w:trPr>
@@ -2303,7 +2378,7 @@
         </w:trPr>
         <w:tc>
           <w:tcPr>
-            <w:tcW w:type="dxa" w:w="2400"/>
+            <w:tcW w:type="dxa" w:w="2600"/>
             <w:shd w:fill="14142B" w:val="clear"/>
             <w:tcMar>
               <w:top w:type="dxa" w:w="60"/>
@@ -2328,7 +2403,7 @@
         </w:tc>
         <w:tc>
           <w:tcPr>
-            <w:tcW w:type="dxa" w:w="2000"/>
+            <w:tcW w:type="dxa" w:w="2200"/>
             <w:shd w:fill="14142B" w:val="clear"/>
             <w:tcMar>
               <w:top w:type="dxa" w:w="60"/>
@@ -2353,7 +2428,7 @@
         </w:tc>
         <w:tc>
           <w:tcPr>
-            <w:tcW w:type="dxa" w:w="4960"/>
+            <w:tcW w:type="dxa" w:w="4560"/>
             <w:shd w:fill="14142B" w:val="clear"/>
             <w:tcMar>
               <w:top w:type="dxa" w:w="60"/>
@@ -2380,73 +2455,73 @@
       <w:tr>
         <w:tc>
           <w:tcPr>
-            <w:tcW w:type="dxa" w:w="2400"/>
-            <w:shd w:fill="FFFFFF" w:val="clear"/>
-            <w:tcMar>
-              <w:top w:type="dxa" w:w="60"/>
-              <w:left w:type="dxa" w:w="110"/>
-              <w:bottom w:type="dxa" w:w="60"/>
-              <w:right w:type="dxa" w:w="110"/>
-            </w:tcMar>
-            <w:vAlign w:val="center"/>
-          </w:tcPr>
-          <w:p>
-            <w:r>
-              <w:rPr>
-                <w:b w:val="false"/>
-                <w:bCs w:val="false"/>
-                <w:sz w:val="19"/>
-                <w:szCs w:val="19"/>
-              </w:rPr>
-              <w:t xml:space="preserve">homeTeam / awayTeam</w:t>
-            </w:r>
-          </w:p>
-        </w:tc>
-        <w:tc>
-          <w:tcPr>
-            <w:tcW w:type="dxa" w:w="2000"/>
-            <w:shd w:fill="FFFFFF" w:val="clear"/>
-            <w:tcMar>
-              <w:top w:type="dxa" w:w="60"/>
-              <w:left w:type="dxa" w:w="110"/>
-              <w:bottom w:type="dxa" w:w="60"/>
-              <w:right w:type="dxa" w:w="110"/>
-            </w:tcMar>
-            <w:vAlign w:val="center"/>
-          </w:tcPr>
-          <w:p>
-            <w:r>
-              <w:rPr>
-                <w:b w:val="false"/>
-                <w:bCs w:val="false"/>
-                <w:sz w:val="19"/>
-                <w:szCs w:val="19"/>
-              </w:rPr>
-              <w:t xml:space="preserve">ObjectId → Team</w:t>
-            </w:r>
-          </w:p>
-        </w:tc>
-        <w:tc>
-          <w:tcPr>
-            <w:tcW w:type="dxa" w:w="4960"/>
-            <w:shd w:fill="FFFFFF" w:val="clear"/>
-            <w:tcMar>
-              <w:top w:type="dxa" w:w="60"/>
-              <w:left w:type="dxa" w:w="110"/>
-              <w:bottom w:type="dxa" w:w="60"/>
-              <w:right w:type="dxa" w:w="110"/>
-            </w:tcMar>
-            <w:vAlign w:val="center"/>
-          </w:tcPr>
-          <w:p>
-            <w:r>
-              <w:rPr>
-                <w:b w:val="false"/>
-                <w:bCs w:val="false"/>
-                <w:sz w:val="19"/>
-                <w:szCs w:val="19"/>
-              </w:rPr>
-              <w:t xml:space="preserve">Equipos local y visitante.</w:t>
+            <w:tcW w:type="dxa" w:w="2600"/>
+            <w:shd w:fill="FFFFFF" w:val="clear"/>
+            <w:tcMar>
+              <w:top w:type="dxa" w:w="60"/>
+              <w:left w:type="dxa" w:w="110"/>
+              <w:bottom w:type="dxa" w:w="60"/>
+              <w:right w:type="dxa" w:w="110"/>
+            </w:tcMar>
+            <w:vAlign w:val="center"/>
+          </w:tcPr>
+          <w:p>
+            <w:r>
+              <w:rPr>
+                <w:b w:val="false"/>
+                <w:bCs w:val="false"/>
+                <w:sz w:val="19"/>
+                <w:szCs w:val="19"/>
+              </w:rPr>
+              <w:t xml:space="preserve">name</w:t>
+            </w:r>
+          </w:p>
+        </w:tc>
+        <w:tc>
+          <w:tcPr>
+            <w:tcW w:type="dxa" w:w="2200"/>
+            <w:shd w:fill="FFFFFF" w:val="clear"/>
+            <w:tcMar>
+              <w:top w:type="dxa" w:w="60"/>
+              <w:left w:type="dxa" w:w="110"/>
+              <w:bottom w:type="dxa" w:w="60"/>
+              <w:right w:type="dxa" w:w="110"/>
+            </w:tcMar>
+            <w:vAlign w:val="center"/>
+          </w:tcPr>
+          <w:p>
+            <w:r>
+              <w:rPr>
+                <w:b w:val="false"/>
+                <w:bCs w:val="false"/>
+                <w:sz w:val="19"/>
+                <w:szCs w:val="19"/>
+              </w:rPr>
+              <w:t xml:space="preserve">String</w:t>
+            </w:r>
+          </w:p>
+        </w:tc>
+        <w:tc>
+          <w:tcPr>
+            <w:tcW w:type="dxa" w:w="4560"/>
+            <w:shd w:fill="FFFFFF" w:val="clear"/>
+            <w:tcMar>
+              <w:top w:type="dxa" w:w="60"/>
+              <w:left w:type="dxa" w:w="110"/>
+              <w:bottom w:type="dxa" w:w="60"/>
+              <w:right w:type="dxa" w:w="110"/>
+            </w:tcMar>
+            <w:vAlign w:val="center"/>
+          </w:tcPr>
+          <w:p>
+            <w:r>
+              <w:rPr>
+                <w:b w:val="false"/>
+                <w:bCs w:val="false"/>
+                <w:sz w:val="19"/>
+                <w:szCs w:val="19"/>
+              </w:rPr>
+              <w:t xml:space="preserve">Nombre del equipo (único).</w:t>
             </w:r>
           </w:p>
         </w:tc>
@@ -2454,7 +2529,7 @@
       <w:tr>
         <w:tc>
           <w:tcPr>
-            <w:tcW w:type="dxa" w:w="2400"/>
+            <w:tcW w:type="dxa" w:w="2600"/>
             <w:shd w:fill="F7F8FA" w:val="clear"/>
             <w:tcMar>
               <w:top w:type="dxa" w:w="60"/>
@@ -2472,13 +2547,13 @@
                 <w:sz w:val="19"/>
                 <w:szCs w:val="19"/>
               </w:rPr>
-              <w:t xml:space="preserve">date / time</w:t>
-            </w:r>
-          </w:p>
-        </w:tc>
-        <w:tc>
-          <w:tcPr>
-            <w:tcW w:type="dxa" w:w="2000"/>
+              <w:t xml:space="preserve">coachName</w:t>
+            </w:r>
+          </w:p>
+        </w:tc>
+        <w:tc>
+          <w:tcPr>
+            <w:tcW w:type="dxa" w:w="2200"/>
             <w:shd w:fill="F7F8FA" w:val="clear"/>
             <w:tcMar>
               <w:top w:type="dxa" w:w="60"/>
@@ -2502,7 +2577,7 @@
         </w:tc>
         <w:tc>
           <w:tcPr>
-            <w:tcW w:type="dxa" w:w="4960"/>
+            <w:tcW w:type="dxa" w:w="4560"/>
             <w:shd w:fill="F7F8FA" w:val="clear"/>
             <w:tcMar>
               <w:top w:type="dxa" w:w="60"/>
@@ -2520,7 +2595,7 @@
                 <w:sz w:val="19"/>
                 <w:szCs w:val="19"/>
               </w:rPr>
-              <w:t xml:space="preserve">Fecha (AAAA-MM-DD) y hora (HH:mm).</w:t>
+              <w:t xml:space="preserve">Nombre del entrenador/a.</w:t>
             </w:r>
           </w:p>
         </w:tc>
@@ -2528,31 +2603,31 @@
       <w:tr>
         <w:tc>
           <w:tcPr>
-            <w:tcW w:type="dxa" w:w="2400"/>
-            <w:shd w:fill="FFFFFF" w:val="clear"/>
-            <w:tcMar>
-              <w:top w:type="dxa" w:w="60"/>
-              <w:left w:type="dxa" w:w="110"/>
-              <w:bottom w:type="dxa" w:w="60"/>
-              <w:right w:type="dxa" w:w="110"/>
-            </w:tcMar>
-            <w:vAlign w:val="center"/>
-          </w:tcPr>
-          <w:p>
-            <w:r>
-              <w:rPr>
-                <w:b w:val="false"/>
-                <w:bCs w:val="false"/>
-                <w:sz w:val="19"/>
-                <w:szCs w:val="19"/>
-              </w:rPr>
-              <w:t xml:space="preserve">venue</w:t>
-            </w:r>
-          </w:p>
-        </w:tc>
-        <w:tc>
-          <w:tcPr>
-            <w:tcW w:type="dxa" w:w="2000"/>
+            <w:tcW w:type="dxa" w:w="2600"/>
+            <w:shd w:fill="FFFFFF" w:val="clear"/>
+            <w:tcMar>
+              <w:top w:type="dxa" w:w="60"/>
+              <w:left w:type="dxa" w:w="110"/>
+              <w:bottom w:type="dxa" w:w="60"/>
+              <w:right w:type="dxa" w:w="110"/>
+            </w:tcMar>
+            <w:vAlign w:val="center"/>
+          </w:tcPr>
+          <w:p>
+            <w:r>
+              <w:rPr>
+                <w:b w:val="false"/>
+                <w:bCs w:val="false"/>
+                <w:sz w:val="19"/>
+                <w:szCs w:val="19"/>
+              </w:rPr>
+              <w:t xml:space="preserve">logoUrl</w:t>
+            </w:r>
+          </w:p>
+        </w:tc>
+        <w:tc>
+          <w:tcPr>
+            <w:tcW w:type="dxa" w:w="2200"/>
             <w:shd w:fill="FFFFFF" w:val="clear"/>
             <w:tcMar>
               <w:top w:type="dxa" w:w="60"/>
@@ -2576,25 +2651,139 @@
         </w:tc>
         <w:tc>
           <w:tcPr>
-            <w:tcW w:type="dxa" w:w="4960"/>
-            <w:shd w:fill="FFFFFF" w:val="clear"/>
-            <w:tcMar>
-              <w:top w:type="dxa" w:w="60"/>
-              <w:left w:type="dxa" w:w="110"/>
-              <w:bottom w:type="dxa" w:w="60"/>
-              <w:right w:type="dxa" w:w="110"/>
-            </w:tcMar>
-            <w:vAlign w:val="center"/>
-          </w:tcPr>
-          <w:p>
-            <w:r>
-              <w:rPr>
-                <w:b w:val="false"/>
-                <w:bCs w:val="false"/>
-                <w:sz w:val="19"/>
-                <w:szCs w:val="19"/>
-              </w:rPr>
-              <w:t xml:space="preserve">Lugar o sede del partido.</w:t>
+            <w:tcW w:type="dxa" w:w="4560"/>
+            <w:shd w:fill="FFFFFF" w:val="clear"/>
+            <w:tcMar>
+              <w:top w:type="dxa" w:w="60"/>
+              <w:left w:type="dxa" w:w="110"/>
+              <w:bottom w:type="dxa" w:w="60"/>
+              <w:right w:type="dxa" w:w="110"/>
+            </w:tcMar>
+            <w:vAlign w:val="center"/>
+          </w:tcPr>
+          <w:p>
+            <w:r>
+              <w:rPr>
+                <w:b w:val="false"/>
+                <w:bCs w:val="false"/>
+                <w:sz w:val="19"/>
+                <w:szCs w:val="19"/>
+              </w:rPr>
+              <w:t xml:space="preserve">URL del escudo / foto (opcional).</w:t>
+            </w:r>
+          </w:p>
+        </w:tc>
+      </w:tr>
+    </w:tbl>
+    <w:p>
+      <w:pPr>
+        <w:spacing w:after="120"/>
+      </w:pPr>
+      <w:r>
+        <w:t xml:space="preserve"/>
+      </w:r>
+    </w:p>
+    <w:p>
+      <w:pPr>
+        <w:pStyle w:val="Heading2"/>
+      </w:pPr>
+      <w:r>
+        <w:t xml:space="preserve">5.5 Jugador (Player)</w:t>
+      </w:r>
+    </w:p>
+    <w:tbl>
+      <w:tblPr>
+        <w:tblW w:type="dxa" w:w="9360"/>
+        <w:tblBorders>
+          <w:top w:val="single" w:color="D2D6DD" w:sz="1"/>
+          <w:left w:val="single" w:color="D2D6DD" w:sz="1"/>
+          <w:bottom w:val="single" w:color="D2D6DD" w:sz="1"/>
+          <w:right w:val="single" w:color="D2D6DD" w:sz="1"/>
+          <w:insideH w:val="single" w:color="D2D6DD" w:sz="1"/>
+          <w:insideV w:val="single" w:color="D2D6DD" w:sz="1"/>
+        </w:tblBorders>
+      </w:tblPr>
+      <w:tblGrid>
+        <w:gridCol w:w="2600"/>
+        <w:gridCol w:w="2200"/>
+        <w:gridCol w:w="4560"/>
+      </w:tblGrid>
+      <w:tr>
+        <w:trPr>
+          <w:tblHeader/>
+        </w:trPr>
+        <w:tc>
+          <w:tcPr>
+            <w:tcW w:type="dxa" w:w="2600"/>
+            <w:shd w:fill="14142B" w:val="clear"/>
+            <w:tcMar>
+              <w:top w:type="dxa" w:w="60"/>
+              <w:left w:type="dxa" w:w="110"/>
+              <w:bottom w:type="dxa" w:w="60"/>
+              <w:right w:type="dxa" w:w="110"/>
+            </w:tcMar>
+            <w:vAlign w:val="center"/>
+          </w:tcPr>
+          <w:p>
+            <w:r>
+              <w:rPr>
+                <w:b/>
+                <w:bCs/>
+                <w:color w:val="FFFFFF"/>
+                <w:sz w:val="19"/>
+                <w:szCs w:val="19"/>
+              </w:rPr>
+              <w:t xml:space="preserve">Campo</w:t>
+            </w:r>
+          </w:p>
+        </w:tc>
+        <w:tc>
+          <w:tcPr>
+            <w:tcW w:type="dxa" w:w="2200"/>
+            <w:shd w:fill="14142B" w:val="clear"/>
+            <w:tcMar>
+              <w:top w:type="dxa" w:w="60"/>
+              <w:left w:type="dxa" w:w="110"/>
+              <w:bottom w:type="dxa" w:w="60"/>
+              <w:right w:type="dxa" w:w="110"/>
+            </w:tcMar>
+            <w:vAlign w:val="center"/>
+          </w:tcPr>
+          <w:p>
+            <w:r>
+              <w:rPr>
+                <w:b/>
+                <w:bCs/>
+                <w:color w:val="FFFFFF"/>
+                <w:sz w:val="19"/>
+                <w:szCs w:val="19"/>
+              </w:rPr>
+              <w:t xml:space="preserve">Tipo</w:t>
+            </w:r>
+          </w:p>
+        </w:tc>
+        <w:tc>
+          <w:tcPr>
+            <w:tcW w:type="dxa" w:w="4560"/>
+            <w:shd w:fill="14142B" w:val="clear"/>
+            <w:tcMar>
+              <w:top w:type="dxa" w:w="60"/>
+              <w:left w:type="dxa" w:w="110"/>
+              <w:bottom w:type="dxa" w:w="60"/>
+              <w:right w:type="dxa" w:w="110"/>
+            </w:tcMar>
+            <w:vAlign w:val="center"/>
+          </w:tcPr>
+          <w:p>
+            <w:r>
+              <w:rPr>
+                <w:b/>
+                <w:bCs/>
+                <w:color w:val="FFFFFF"/>
+                <w:sz w:val="19"/>
+                <w:szCs w:val="19"/>
+              </w:rPr>
+              <w:t xml:space="preserve">Descripción</w:t>
             </w:r>
           </w:p>
         </w:tc>
@@ -2602,32 +2791,32 @@
       <w:tr>
         <w:tc>
           <w:tcPr>
-            <w:tcW w:type="dxa" w:w="2400"/>
-            <w:shd w:fill="F7F8FA" w:val="clear"/>
-            <w:tcMar>
-              <w:top w:type="dxa" w:w="60"/>
-              <w:left w:type="dxa" w:w="110"/>
-              <w:bottom w:type="dxa" w:w="60"/>
-              <w:right w:type="dxa" w:w="110"/>
-            </w:tcMar>
-            <w:vAlign w:val="center"/>
-          </w:tcPr>
-          <w:p>
-            <w:r>
-              <w:rPr>
-                <w:b w:val="false"/>
-                <w:bCs w:val="false"/>
-                <w:sz w:val="19"/>
-                <w:szCs w:val="19"/>
-              </w:rPr>
-              <w:t xml:space="preserve">status</w:t>
-            </w:r>
-          </w:p>
-        </w:tc>
-        <w:tc>
-          <w:tcPr>
-            <w:tcW w:type="dxa" w:w="2000"/>
-            <w:shd w:fill="F7F8FA" w:val="clear"/>
+            <w:tcW w:type="dxa" w:w="2600"/>
+            <w:shd w:fill="FFFFFF" w:val="clear"/>
+            <w:tcMar>
+              <w:top w:type="dxa" w:w="60"/>
+              <w:left w:type="dxa" w:w="110"/>
+              <w:bottom w:type="dxa" w:w="60"/>
+              <w:right w:type="dxa" w:w="110"/>
+            </w:tcMar>
+            <w:vAlign w:val="center"/>
+          </w:tcPr>
+          <w:p>
+            <w:r>
+              <w:rPr>
+                <w:b w:val="false"/>
+                <w:bCs w:val="false"/>
+                <w:sz w:val="19"/>
+                <w:szCs w:val="19"/>
+              </w:rPr>
+              <w:t xml:space="preserve">firstName / lastName</w:t>
+            </w:r>
+          </w:p>
+        </w:tc>
+        <w:tc>
+          <w:tcPr>
+            <w:tcW w:type="dxa" w:w="2200"/>
+            <w:shd w:fill="FFFFFF" w:val="clear"/>
             <w:tcMar>
               <w:top w:type="dxa" w:w="60"/>
               <w:left w:type="dxa" w:w="110"/>
@@ -2650,25 +2839,25 @@
         </w:tc>
         <w:tc>
           <w:tcPr>
-            <w:tcW w:type="dxa" w:w="4960"/>
-            <w:shd w:fill="F7F8FA" w:val="clear"/>
-            <w:tcMar>
-              <w:top w:type="dxa" w:w="60"/>
-              <w:left w:type="dxa" w:w="110"/>
-              <w:bottom w:type="dxa" w:w="60"/>
-              <w:right w:type="dxa" w:w="110"/>
-            </w:tcMar>
-            <w:vAlign w:val="center"/>
-          </w:tcPr>
-          <w:p>
-            <w:r>
-              <w:rPr>
-                <w:b w:val="false"/>
-                <w:bCs w:val="false"/>
-                <w:sz w:val="19"/>
-                <w:szCs w:val="19"/>
-              </w:rPr>
-              <w:t xml:space="preserve">scheduled (programado) o played (jugado).</w:t>
+            <w:tcW w:type="dxa" w:w="4560"/>
+            <w:shd w:fill="FFFFFF" w:val="clear"/>
+            <w:tcMar>
+              <w:top w:type="dxa" w:w="60"/>
+              <w:left w:type="dxa" w:w="110"/>
+              <w:bottom w:type="dxa" w:w="60"/>
+              <w:right w:type="dxa" w:w="110"/>
+            </w:tcMar>
+            <w:vAlign w:val="center"/>
+          </w:tcPr>
+          <w:p>
+            <w:r>
+              <w:rPr>
+                <w:b w:val="false"/>
+                <w:bCs w:val="false"/>
+                <w:sz w:val="19"/>
+                <w:szCs w:val="19"/>
+              </w:rPr>
+              <w:t xml:space="preserve">Nombre y apellido.</w:t>
             </w:r>
           </w:p>
         </w:tc>
@@ -2676,7 +2865,713 @@
       <w:tr>
         <w:tc>
           <w:tcPr>
-            <w:tcW w:type="dxa" w:w="2400"/>
+            <w:tcW w:type="dxa" w:w="2600"/>
+            <w:shd w:fill="F7F8FA" w:val="clear"/>
+            <w:tcMar>
+              <w:top w:type="dxa" w:w="60"/>
+              <w:left w:type="dxa" w:w="110"/>
+              <w:bottom w:type="dxa" w:w="60"/>
+              <w:right w:type="dxa" w:w="110"/>
+            </w:tcMar>
+            <w:vAlign w:val="center"/>
+          </w:tcPr>
+          <w:p>
+            <w:r>
+              <w:rPr>
+                <w:b w:val="false"/>
+                <w:bCs w:val="false"/>
+                <w:sz w:val="19"/>
+                <w:szCs w:val="19"/>
+              </w:rPr>
+              <w:t xml:space="preserve">category</w:t>
+            </w:r>
+          </w:p>
+        </w:tc>
+        <w:tc>
+          <w:tcPr>
+            <w:tcW w:type="dxa" w:w="2200"/>
+            <w:shd w:fill="F7F8FA" w:val="clear"/>
+            <w:tcMar>
+              <w:top w:type="dxa" w:w="60"/>
+              <w:left w:type="dxa" w:w="110"/>
+              <w:bottom w:type="dxa" w:w="60"/>
+              <w:right w:type="dxa" w:w="110"/>
+            </w:tcMar>
+            <w:vAlign w:val="center"/>
+          </w:tcPr>
+          <w:p>
+            <w:r>
+              <w:rPr>
+                <w:b w:val="false"/>
+                <w:bCs w:val="false"/>
+                <w:sz w:val="19"/>
+                <w:szCs w:val="19"/>
+              </w:rPr>
+              <w:t xml:space="preserve">String</w:t>
+            </w:r>
+          </w:p>
+        </w:tc>
+        <w:tc>
+          <w:tcPr>
+            <w:tcW w:type="dxa" w:w="4560"/>
+            <w:shd w:fill="F7F8FA" w:val="clear"/>
+            <w:tcMar>
+              <w:top w:type="dxa" w:w="60"/>
+              <w:left w:type="dxa" w:w="110"/>
+              <w:bottom w:type="dxa" w:w="60"/>
+              <w:right w:type="dxa" w:w="110"/>
+            </w:tcMar>
+            <w:vAlign w:val="center"/>
+          </w:tcPr>
+          <w:p>
+            <w:r>
+              <w:rPr>
+                <w:b w:val="false"/>
+                <w:bCs w:val="false"/>
+                <w:sz w:val="19"/>
+                <w:szCs w:val="19"/>
+              </w:rPr>
+              <w:t xml:space="preserve">Categoría del jugador.</w:t>
+            </w:r>
+          </w:p>
+        </w:tc>
+      </w:tr>
+      <w:tr>
+        <w:tc>
+          <w:tcPr>
+            <w:tcW w:type="dxa" w:w="2600"/>
+            <w:shd w:fill="FFFFFF" w:val="clear"/>
+            <w:tcMar>
+              <w:top w:type="dxa" w:w="60"/>
+              <w:left w:type="dxa" w:w="110"/>
+              <w:bottom w:type="dxa" w:w="60"/>
+              <w:right w:type="dxa" w:w="110"/>
+            </w:tcMar>
+            <w:vAlign w:val="center"/>
+          </w:tcPr>
+          <w:p>
+            <w:r>
+              <w:rPr>
+                <w:b w:val="false"/>
+                <w:bCs w:val="false"/>
+                <w:sz w:val="19"/>
+                <w:szCs w:val="19"/>
+              </w:rPr>
+              <w:t xml:space="preserve">team</w:t>
+            </w:r>
+          </w:p>
+        </w:tc>
+        <w:tc>
+          <w:tcPr>
+            <w:tcW w:type="dxa" w:w="2200"/>
+            <w:shd w:fill="FFFFFF" w:val="clear"/>
+            <w:tcMar>
+              <w:top w:type="dxa" w:w="60"/>
+              <w:left w:type="dxa" w:w="110"/>
+              <w:bottom w:type="dxa" w:w="60"/>
+              <w:right w:type="dxa" w:w="110"/>
+            </w:tcMar>
+            <w:vAlign w:val="center"/>
+          </w:tcPr>
+          <w:p>
+            <w:r>
+              <w:rPr>
+                <w:b w:val="false"/>
+                <w:bCs w:val="false"/>
+                <w:sz w:val="19"/>
+                <w:szCs w:val="19"/>
+              </w:rPr>
+              <w:t xml:space="preserve">ObjectId → Team</w:t>
+            </w:r>
+          </w:p>
+        </w:tc>
+        <w:tc>
+          <w:tcPr>
+            <w:tcW w:type="dxa" w:w="4560"/>
+            <w:shd w:fill="FFFFFF" w:val="clear"/>
+            <w:tcMar>
+              <w:top w:type="dxa" w:w="60"/>
+              <w:left w:type="dxa" w:w="110"/>
+              <w:bottom w:type="dxa" w:w="60"/>
+              <w:right w:type="dxa" w:w="110"/>
+            </w:tcMar>
+            <w:vAlign w:val="center"/>
+          </w:tcPr>
+          <w:p>
+            <w:r>
+              <w:rPr>
+                <w:b w:val="false"/>
+                <w:bCs w:val="false"/>
+                <w:sz w:val="19"/>
+                <w:szCs w:val="19"/>
+              </w:rPr>
+              <w:t xml:space="preserve">Equipo al que pertenece.</w:t>
+            </w:r>
+          </w:p>
+        </w:tc>
+      </w:tr>
+    </w:tbl>
+    <w:p>
+      <w:pPr>
+        <w:spacing w:after="120"/>
+      </w:pPr>
+      <w:r>
+        <w:t xml:space="preserve"/>
+      </w:r>
+    </w:p>
+    <w:p>
+      <w:pPr>
+        <w:pStyle w:val="Heading2"/>
+      </w:pPr>
+      <w:r>
+        <w:t xml:space="preserve">5.6 Partido (Match)</w:t>
+      </w:r>
+    </w:p>
+    <w:tbl>
+      <w:tblPr>
+        <w:tblW w:type="dxa" w:w="9360"/>
+        <w:tblBorders>
+          <w:top w:val="single" w:color="D2D6DD" w:sz="1"/>
+          <w:left w:val="single" w:color="D2D6DD" w:sz="1"/>
+          <w:bottom w:val="single" w:color="D2D6DD" w:sz="1"/>
+          <w:right w:val="single" w:color="D2D6DD" w:sz="1"/>
+          <w:insideH w:val="single" w:color="D2D6DD" w:sz="1"/>
+          <w:insideV w:val="single" w:color="D2D6DD" w:sz="1"/>
+        </w:tblBorders>
+      </w:tblPr>
+      <w:tblGrid>
+        <w:gridCol w:w="2600"/>
+        <w:gridCol w:w="2200"/>
+        <w:gridCol w:w="4560"/>
+      </w:tblGrid>
+      <w:tr>
+        <w:trPr>
+          <w:tblHeader/>
+        </w:trPr>
+        <w:tc>
+          <w:tcPr>
+            <w:tcW w:type="dxa" w:w="2600"/>
+            <w:shd w:fill="14142B" w:val="clear"/>
+            <w:tcMar>
+              <w:top w:type="dxa" w:w="60"/>
+              <w:left w:type="dxa" w:w="110"/>
+              <w:bottom w:type="dxa" w:w="60"/>
+              <w:right w:type="dxa" w:w="110"/>
+            </w:tcMar>
+            <w:vAlign w:val="center"/>
+          </w:tcPr>
+          <w:p>
+            <w:r>
+              <w:rPr>
+                <w:b/>
+                <w:bCs/>
+                <w:color w:val="FFFFFF"/>
+                <w:sz w:val="19"/>
+                <w:szCs w:val="19"/>
+              </w:rPr>
+              <w:t xml:space="preserve">Campo</w:t>
+            </w:r>
+          </w:p>
+        </w:tc>
+        <w:tc>
+          <w:tcPr>
+            <w:tcW w:type="dxa" w:w="2200"/>
+            <w:shd w:fill="14142B" w:val="clear"/>
+            <w:tcMar>
+              <w:top w:type="dxa" w:w="60"/>
+              <w:left w:type="dxa" w:w="110"/>
+              <w:bottom w:type="dxa" w:w="60"/>
+              <w:right w:type="dxa" w:w="110"/>
+            </w:tcMar>
+            <w:vAlign w:val="center"/>
+          </w:tcPr>
+          <w:p>
+            <w:r>
+              <w:rPr>
+                <w:b/>
+                <w:bCs/>
+                <w:color w:val="FFFFFF"/>
+                <w:sz w:val="19"/>
+                <w:szCs w:val="19"/>
+              </w:rPr>
+              <w:t xml:space="preserve">Tipo</w:t>
+            </w:r>
+          </w:p>
+        </w:tc>
+        <w:tc>
+          <w:tcPr>
+            <w:tcW w:type="dxa" w:w="4560"/>
+            <w:shd w:fill="14142B" w:val="clear"/>
+            <w:tcMar>
+              <w:top w:type="dxa" w:w="60"/>
+              <w:left w:type="dxa" w:w="110"/>
+              <w:bottom w:type="dxa" w:w="60"/>
+              <w:right w:type="dxa" w:w="110"/>
+            </w:tcMar>
+            <w:vAlign w:val="center"/>
+          </w:tcPr>
+          <w:p>
+            <w:r>
+              <w:rPr>
+                <w:b/>
+                <w:bCs/>
+                <w:color w:val="FFFFFF"/>
+                <w:sz w:val="19"/>
+                <w:szCs w:val="19"/>
+              </w:rPr>
+              <w:t xml:space="preserve">Descripción</w:t>
+            </w:r>
+          </w:p>
+        </w:tc>
+      </w:tr>
+      <w:tr>
+        <w:tc>
+          <w:tcPr>
+            <w:tcW w:type="dxa" w:w="2600"/>
+            <w:shd w:fill="FFFFFF" w:val="clear"/>
+            <w:tcMar>
+              <w:top w:type="dxa" w:w="60"/>
+              <w:left w:type="dxa" w:w="110"/>
+              <w:bottom w:type="dxa" w:w="60"/>
+              <w:right w:type="dxa" w:w="110"/>
+            </w:tcMar>
+            <w:vAlign w:val="center"/>
+          </w:tcPr>
+          <w:p>
+            <w:r>
+              <w:rPr>
+                <w:b w:val="false"/>
+                <w:bCs w:val="false"/>
+                <w:sz w:val="19"/>
+                <w:szCs w:val="19"/>
+              </w:rPr>
+              <w:t xml:space="preserve">season</w:t>
+            </w:r>
+          </w:p>
+        </w:tc>
+        <w:tc>
+          <w:tcPr>
+            <w:tcW w:type="dxa" w:w="2200"/>
+            <w:shd w:fill="FFFFFF" w:val="clear"/>
+            <w:tcMar>
+              <w:top w:type="dxa" w:w="60"/>
+              <w:left w:type="dxa" w:w="110"/>
+              <w:bottom w:type="dxa" w:w="60"/>
+              <w:right w:type="dxa" w:w="110"/>
+            </w:tcMar>
+            <w:vAlign w:val="center"/>
+          </w:tcPr>
+          <w:p>
+            <w:r>
+              <w:rPr>
+                <w:b w:val="false"/>
+                <w:bCs w:val="false"/>
+                <w:sz w:val="19"/>
+                <w:szCs w:val="19"/>
+              </w:rPr>
+              <w:t xml:space="preserve">ObjectId → Season</w:t>
+            </w:r>
+          </w:p>
+        </w:tc>
+        <w:tc>
+          <w:tcPr>
+            <w:tcW w:type="dxa" w:w="4560"/>
+            <w:shd w:fill="FFFFFF" w:val="clear"/>
+            <w:tcMar>
+              <w:top w:type="dxa" w:w="60"/>
+              <w:left w:type="dxa" w:w="110"/>
+              <w:bottom w:type="dxa" w:w="60"/>
+              <w:right w:type="dxa" w:w="110"/>
+            </w:tcMar>
+            <w:vAlign w:val="center"/>
+          </w:tcPr>
+          <w:p>
+            <w:r>
+              <w:rPr>
+                <w:b w:val="false"/>
+                <w:bCs w:val="false"/>
+                <w:sz w:val="19"/>
+                <w:szCs w:val="19"/>
+              </w:rPr>
+              <w:t xml:space="preserve">Temporada del partido.</w:t>
+            </w:r>
+          </w:p>
+        </w:tc>
+      </w:tr>
+      <w:tr>
+        <w:tc>
+          <w:tcPr>
+            <w:tcW w:type="dxa" w:w="2600"/>
+            <w:shd w:fill="F7F8FA" w:val="clear"/>
+            <w:tcMar>
+              <w:top w:type="dxa" w:w="60"/>
+              <w:left w:type="dxa" w:w="110"/>
+              <w:bottom w:type="dxa" w:w="60"/>
+              <w:right w:type="dxa" w:w="110"/>
+            </w:tcMar>
+            <w:vAlign w:val="center"/>
+          </w:tcPr>
+          <w:p>
+            <w:r>
+              <w:rPr>
+                <w:b w:val="false"/>
+                <w:bCs w:val="false"/>
+                <w:sz w:val="19"/>
+                <w:szCs w:val="19"/>
+              </w:rPr>
+              <w:t xml:space="preserve">category</w:t>
+            </w:r>
+          </w:p>
+        </w:tc>
+        <w:tc>
+          <w:tcPr>
+            <w:tcW w:type="dxa" w:w="2200"/>
+            <w:shd w:fill="F7F8FA" w:val="clear"/>
+            <w:tcMar>
+              <w:top w:type="dxa" w:w="60"/>
+              <w:left w:type="dxa" w:w="110"/>
+              <w:bottom w:type="dxa" w:w="60"/>
+              <w:right w:type="dxa" w:w="110"/>
+            </w:tcMar>
+            <w:vAlign w:val="center"/>
+          </w:tcPr>
+          <w:p>
+            <w:r>
+              <w:rPr>
+                <w:b w:val="false"/>
+                <w:bCs w:val="false"/>
+                <w:sz w:val="19"/>
+                <w:szCs w:val="19"/>
+              </w:rPr>
+              <w:t xml:space="preserve">String</w:t>
+            </w:r>
+          </w:p>
+        </w:tc>
+        <w:tc>
+          <w:tcPr>
+            <w:tcW w:type="dxa" w:w="4560"/>
+            <w:shd w:fill="F7F8FA" w:val="clear"/>
+            <w:tcMar>
+              <w:top w:type="dxa" w:w="60"/>
+              <w:left w:type="dxa" w:w="110"/>
+              <w:bottom w:type="dxa" w:w="60"/>
+              <w:right w:type="dxa" w:w="110"/>
+            </w:tcMar>
+            <w:vAlign w:val="center"/>
+          </w:tcPr>
+          <w:p>
+            <w:r>
+              <w:rPr>
+                <w:b w:val="false"/>
+                <w:bCs w:val="false"/>
+                <w:sz w:val="19"/>
+                <w:szCs w:val="19"/>
+              </w:rPr>
+              <w:t xml:space="preserve">Categoría (torneo) del partido.</w:t>
+            </w:r>
+          </w:p>
+        </w:tc>
+      </w:tr>
+      <w:tr>
+        <w:tc>
+          <w:tcPr>
+            <w:tcW w:type="dxa" w:w="2600"/>
+            <w:shd w:fill="FFFFFF" w:val="clear"/>
+            <w:tcMar>
+              <w:top w:type="dxa" w:w="60"/>
+              <w:left w:type="dxa" w:w="110"/>
+              <w:bottom w:type="dxa" w:w="60"/>
+              <w:right w:type="dxa" w:w="110"/>
+            </w:tcMar>
+            <w:vAlign w:val="center"/>
+          </w:tcPr>
+          <w:p>
+            <w:r>
+              <w:rPr>
+                <w:b w:val="false"/>
+                <w:bCs w:val="false"/>
+                <w:sz w:val="19"/>
+                <w:szCs w:val="19"/>
+              </w:rPr>
+              <w:t xml:space="preserve">homeTeam / awayTeam</w:t>
+            </w:r>
+          </w:p>
+        </w:tc>
+        <w:tc>
+          <w:tcPr>
+            <w:tcW w:type="dxa" w:w="2200"/>
+            <w:shd w:fill="FFFFFF" w:val="clear"/>
+            <w:tcMar>
+              <w:top w:type="dxa" w:w="60"/>
+              <w:left w:type="dxa" w:w="110"/>
+              <w:bottom w:type="dxa" w:w="60"/>
+              <w:right w:type="dxa" w:w="110"/>
+            </w:tcMar>
+            <w:vAlign w:val="center"/>
+          </w:tcPr>
+          <w:p>
+            <w:r>
+              <w:rPr>
+                <w:b w:val="false"/>
+                <w:bCs w:val="false"/>
+                <w:sz w:val="19"/>
+                <w:szCs w:val="19"/>
+              </w:rPr>
+              <w:t xml:space="preserve">ObjectId → Team</w:t>
+            </w:r>
+          </w:p>
+        </w:tc>
+        <w:tc>
+          <w:tcPr>
+            <w:tcW w:type="dxa" w:w="4560"/>
+            <w:shd w:fill="FFFFFF" w:val="clear"/>
+            <w:tcMar>
+              <w:top w:type="dxa" w:w="60"/>
+              <w:left w:type="dxa" w:w="110"/>
+              <w:bottom w:type="dxa" w:w="60"/>
+              <w:right w:type="dxa" w:w="110"/>
+            </w:tcMar>
+            <w:vAlign w:val="center"/>
+          </w:tcPr>
+          <w:p>
+            <w:r>
+              <w:rPr>
+                <w:b w:val="false"/>
+                <w:bCs w:val="false"/>
+                <w:sz w:val="19"/>
+                <w:szCs w:val="19"/>
+              </w:rPr>
+              <w:t xml:space="preserve">Equipos local y visitante.</w:t>
+            </w:r>
+          </w:p>
+        </w:tc>
+      </w:tr>
+      <w:tr>
+        <w:tc>
+          <w:tcPr>
+            <w:tcW w:type="dxa" w:w="2600"/>
+            <w:shd w:fill="F7F8FA" w:val="clear"/>
+            <w:tcMar>
+              <w:top w:type="dxa" w:w="60"/>
+              <w:left w:type="dxa" w:w="110"/>
+              <w:bottom w:type="dxa" w:w="60"/>
+              <w:right w:type="dxa" w:w="110"/>
+            </w:tcMar>
+            <w:vAlign w:val="center"/>
+          </w:tcPr>
+          <w:p>
+            <w:r>
+              <w:rPr>
+                <w:b w:val="false"/>
+                <w:bCs w:val="false"/>
+                <w:sz w:val="19"/>
+                <w:szCs w:val="19"/>
+              </w:rPr>
+              <w:t xml:space="preserve">date / time</w:t>
+            </w:r>
+          </w:p>
+        </w:tc>
+        <w:tc>
+          <w:tcPr>
+            <w:tcW w:type="dxa" w:w="2200"/>
+            <w:shd w:fill="F7F8FA" w:val="clear"/>
+            <w:tcMar>
+              <w:top w:type="dxa" w:w="60"/>
+              <w:left w:type="dxa" w:w="110"/>
+              <w:bottom w:type="dxa" w:w="60"/>
+              <w:right w:type="dxa" w:w="110"/>
+            </w:tcMar>
+            <w:vAlign w:val="center"/>
+          </w:tcPr>
+          <w:p>
+            <w:r>
+              <w:rPr>
+                <w:b w:val="false"/>
+                <w:bCs w:val="false"/>
+                <w:sz w:val="19"/>
+                <w:szCs w:val="19"/>
+              </w:rPr>
+              <w:t xml:space="preserve">String</w:t>
+            </w:r>
+          </w:p>
+        </w:tc>
+        <w:tc>
+          <w:tcPr>
+            <w:tcW w:type="dxa" w:w="4560"/>
+            <w:shd w:fill="F7F8FA" w:val="clear"/>
+            <w:tcMar>
+              <w:top w:type="dxa" w:w="60"/>
+              <w:left w:type="dxa" w:w="110"/>
+              <w:bottom w:type="dxa" w:w="60"/>
+              <w:right w:type="dxa" w:w="110"/>
+            </w:tcMar>
+            <w:vAlign w:val="center"/>
+          </w:tcPr>
+          <w:p>
+            <w:r>
+              <w:rPr>
+                <w:b w:val="false"/>
+                <w:bCs w:val="false"/>
+                <w:sz w:val="19"/>
+                <w:szCs w:val="19"/>
+              </w:rPr>
+              <w:t xml:space="preserve">Fecha (AAAA-MM-DD) y hora (HH:mm).</w:t>
+            </w:r>
+          </w:p>
+        </w:tc>
+      </w:tr>
+      <w:tr>
+        <w:tc>
+          <w:tcPr>
+            <w:tcW w:type="dxa" w:w="2600"/>
+            <w:shd w:fill="FFFFFF" w:val="clear"/>
+            <w:tcMar>
+              <w:top w:type="dxa" w:w="60"/>
+              <w:left w:type="dxa" w:w="110"/>
+              <w:bottom w:type="dxa" w:w="60"/>
+              <w:right w:type="dxa" w:w="110"/>
+            </w:tcMar>
+            <w:vAlign w:val="center"/>
+          </w:tcPr>
+          <w:p>
+            <w:r>
+              <w:rPr>
+                <w:b w:val="false"/>
+                <w:bCs w:val="false"/>
+                <w:sz w:val="19"/>
+                <w:szCs w:val="19"/>
+              </w:rPr>
+              <w:t xml:space="preserve">venue</w:t>
+            </w:r>
+          </w:p>
+        </w:tc>
+        <w:tc>
+          <w:tcPr>
+            <w:tcW w:type="dxa" w:w="2200"/>
+            <w:shd w:fill="FFFFFF" w:val="clear"/>
+            <w:tcMar>
+              <w:top w:type="dxa" w:w="60"/>
+              <w:left w:type="dxa" w:w="110"/>
+              <w:bottom w:type="dxa" w:w="60"/>
+              <w:right w:type="dxa" w:w="110"/>
+            </w:tcMar>
+            <w:vAlign w:val="center"/>
+          </w:tcPr>
+          <w:p>
+            <w:r>
+              <w:rPr>
+                <w:b w:val="false"/>
+                <w:bCs w:val="false"/>
+                <w:sz w:val="19"/>
+                <w:szCs w:val="19"/>
+              </w:rPr>
+              <w:t xml:space="preserve">String</w:t>
+            </w:r>
+          </w:p>
+        </w:tc>
+        <w:tc>
+          <w:tcPr>
+            <w:tcW w:type="dxa" w:w="4560"/>
+            <w:shd w:fill="FFFFFF" w:val="clear"/>
+            <w:tcMar>
+              <w:top w:type="dxa" w:w="60"/>
+              <w:left w:type="dxa" w:w="110"/>
+              <w:bottom w:type="dxa" w:w="60"/>
+              <w:right w:type="dxa" w:w="110"/>
+            </w:tcMar>
+            <w:vAlign w:val="center"/>
+          </w:tcPr>
+          <w:p>
+            <w:r>
+              <w:rPr>
+                <w:b w:val="false"/>
+                <w:bCs w:val="false"/>
+                <w:sz w:val="19"/>
+                <w:szCs w:val="19"/>
+              </w:rPr>
+              <w:t xml:space="preserve">Lugar o sede del partido.</w:t>
+            </w:r>
+          </w:p>
+        </w:tc>
+      </w:tr>
+      <w:tr>
+        <w:tc>
+          <w:tcPr>
+            <w:tcW w:type="dxa" w:w="2600"/>
+            <w:shd w:fill="F7F8FA" w:val="clear"/>
+            <w:tcMar>
+              <w:top w:type="dxa" w:w="60"/>
+              <w:left w:type="dxa" w:w="110"/>
+              <w:bottom w:type="dxa" w:w="60"/>
+              <w:right w:type="dxa" w:w="110"/>
+            </w:tcMar>
+            <w:vAlign w:val="center"/>
+          </w:tcPr>
+          <w:p>
+            <w:r>
+              <w:rPr>
+                <w:b w:val="false"/>
+                <w:bCs w:val="false"/>
+                <w:sz w:val="19"/>
+                <w:szCs w:val="19"/>
+              </w:rPr>
+              <w:t xml:space="preserve">status</w:t>
+            </w:r>
+          </w:p>
+        </w:tc>
+        <w:tc>
+          <w:tcPr>
+            <w:tcW w:type="dxa" w:w="2200"/>
+            <w:shd w:fill="F7F8FA" w:val="clear"/>
+            <w:tcMar>
+              <w:top w:type="dxa" w:w="60"/>
+              <w:left w:type="dxa" w:w="110"/>
+              <w:bottom w:type="dxa" w:w="60"/>
+              <w:right w:type="dxa" w:w="110"/>
+            </w:tcMar>
+            <w:vAlign w:val="center"/>
+          </w:tcPr>
+          <w:p>
+            <w:r>
+              <w:rPr>
+                <w:b w:val="false"/>
+                <w:bCs w:val="false"/>
+                <w:sz w:val="19"/>
+                <w:szCs w:val="19"/>
+              </w:rPr>
+              <w:t xml:space="preserve">String</w:t>
+            </w:r>
+          </w:p>
+        </w:tc>
+        <w:tc>
+          <w:tcPr>
+            <w:tcW w:type="dxa" w:w="4560"/>
+            <w:shd w:fill="F7F8FA" w:val="clear"/>
+            <w:tcMar>
+              <w:top w:type="dxa" w:w="60"/>
+              <w:left w:type="dxa" w:w="110"/>
+              <w:bottom w:type="dxa" w:w="60"/>
+              <w:right w:type="dxa" w:w="110"/>
+            </w:tcMar>
+            <w:vAlign w:val="center"/>
+          </w:tcPr>
+          <w:p>
+            <w:r>
+              <w:rPr>
+                <w:b w:val="false"/>
+                <w:bCs w:val="false"/>
+                <w:sz w:val="19"/>
+                <w:szCs w:val="19"/>
+              </w:rPr>
+              <w:t xml:space="preserve">scheduled (programado) o played (jugado).</w:t>
+            </w:r>
+          </w:p>
+        </w:tc>
+      </w:tr>
+      <w:tr>
+        <w:tc>
+          <w:tcPr>
+            <w:tcW w:type="dxa" w:w="2600"/>
             <w:shd w:fill="FFFFFF" w:val="clear"/>
             <w:tcMar>
               <w:top w:type="dxa" w:w="60"/>
@@ -2700,7 +3595,7 @@
         </w:tc>
         <w:tc>
           <w:tcPr>
-            <w:tcW w:type="dxa" w:w="2000"/>
+            <w:tcW w:type="dxa" w:w="2200"/>
             <w:shd w:fill="FFFFFF" w:val="clear"/>
             <w:tcMar>
               <w:top w:type="dxa" w:w="60"/>
@@ -2724,7 +3619,7 @@
         </w:tc>
         <w:tc>
           <w:tcPr>
-            <w:tcW w:type="dxa" w:w="4960"/>
+            <w:tcW w:type="dxa" w:w="4560"/>
             <w:shd w:fill="FFFFFF" w:val="clear"/>
             <w:tcMar>
               <w:top w:type="dxa" w:w="60"/>
@@ -2764,7 +3659,7 @@
         <w:rPr>
           <w:color w:val="2B2F3A"/>
         </w:rPr>
-        <w:t xml:space="preserve">La API se expone bajo el prefijo /api. Las rutas públicas no requieren autenticación; las administrativas exigen la cabecera Authorization: Bearer &lt;token&gt;.</w:t>
+        <w:t xml:space="preserve">La API se expone bajo el prefijo /api. Las rutas públicas no requieren autenticación; las administrativas exigen la cabecera Authorization: Bearer &lt;token&gt;. La clasificación, el calendario, los resultados y el detalle de equipo aceptan los parámetros de consulta season y category para indicar el torneo.</w:t>
       </w:r>
     </w:p>
     <w:p>
@@ -2789,8 +3684,8 @@
       </w:tblPr>
       <w:tblGrid>
         <w:gridCol w:w="1100"/>
-        <w:gridCol w:w="3260"/>
-        <w:gridCol w:w="5000"/>
+        <w:gridCol w:w="3360"/>
+        <w:gridCol w:w="4900"/>
       </w:tblGrid>
       <w:tr>
         <w:trPr>
@@ -2823,7 +3718,7 @@
         </w:tc>
         <w:tc>
           <w:tcPr>
-            <w:tcW w:type="dxa" w:w="3260"/>
+            <w:tcW w:type="dxa" w:w="3360"/>
             <w:shd w:fill="14142B" w:val="clear"/>
             <w:tcMar>
               <w:top w:type="dxa" w:w="60"/>
@@ -2848,7 +3743,7 @@
         </w:tc>
         <w:tc>
           <w:tcPr>
-            <w:tcW w:type="dxa" w:w="5000"/>
+            <w:tcW w:type="dxa" w:w="4900"/>
             <w:shd w:fill="14142B" w:val="clear"/>
             <w:tcMar>
               <w:top w:type="dxa" w:w="60"/>
@@ -2899,7 +3794,7 @@
         </w:tc>
         <w:tc>
           <w:tcPr>
-            <w:tcW w:type="dxa" w:w="3260"/>
+            <w:tcW w:type="dxa" w:w="3360"/>
             <w:shd w:fill="FFFFFF" w:val="clear"/>
             <w:tcMar>
               <w:top w:type="dxa" w:w="60"/>
@@ -2923,7 +3818,7 @@
         </w:tc>
         <w:tc>
           <w:tcPr>
-            <w:tcW w:type="dxa" w:w="5000"/>
+            <w:tcW w:type="dxa" w:w="4900"/>
             <w:shd w:fill="FFFFFF" w:val="clear"/>
             <w:tcMar>
               <w:top w:type="dxa" w:w="60"/>
@@ -2973,7 +3868,7 @@
         </w:tc>
         <w:tc>
           <w:tcPr>
-            <w:tcW w:type="dxa" w:w="3260"/>
+            <w:tcW w:type="dxa" w:w="3360"/>
             <w:shd w:fill="F7F8FA" w:val="clear"/>
             <w:tcMar>
               <w:top w:type="dxa" w:w="60"/>
@@ -2991,13 +3886,13 @@
                 <w:sz w:val="19"/>
                 <w:szCs w:val="19"/>
               </w:rPr>
-              <w:t xml:space="preserve">/api/standings</w:t>
-            </w:r>
-          </w:p>
-        </w:tc>
-        <w:tc>
-          <w:tcPr>
-            <w:tcW w:type="dxa" w:w="5000"/>
+              <w:t xml:space="preserve">/api/seasons</w:t>
+            </w:r>
+          </w:p>
+        </w:tc>
+        <w:tc>
+          <w:tcPr>
+            <w:tcW w:type="dxa" w:w="4900"/>
             <w:shd w:fill="F7F8FA" w:val="clear"/>
             <w:tcMar>
               <w:top w:type="dxa" w:w="60"/>
@@ -3015,7 +3910,7 @@
                 <w:sz w:val="19"/>
                 <w:szCs w:val="19"/>
               </w:rPr>
-              <w:t xml:space="preserve">Tabla de clasificación (ya ordenada).</w:t>
+              <w:t xml:space="preserve">Listado de temporadas.</w:t>
             </w:r>
           </w:p>
         </w:tc>
@@ -3047,49 +3942,49 @@
         </w:tc>
         <w:tc>
           <w:tcPr>
-            <w:tcW w:type="dxa" w:w="3260"/>
-            <w:shd w:fill="FFFFFF" w:val="clear"/>
-            <w:tcMar>
-              <w:top w:type="dxa" w:w="60"/>
-              <w:left w:type="dxa" w:w="110"/>
-              <w:bottom w:type="dxa" w:w="60"/>
-              <w:right w:type="dxa" w:w="110"/>
-            </w:tcMar>
-            <w:vAlign w:val="center"/>
-          </w:tcPr>
-          <w:p>
-            <w:r>
-              <w:rPr>
-                <w:b w:val="false"/>
-                <w:bCs w:val="false"/>
-                <w:sz w:val="19"/>
-                <w:szCs w:val="19"/>
-              </w:rPr>
-              <w:t xml:space="preserve">/api/teams</w:t>
-            </w:r>
-          </w:p>
-        </w:tc>
-        <w:tc>
-          <w:tcPr>
-            <w:tcW w:type="dxa" w:w="5000"/>
-            <w:shd w:fill="FFFFFF" w:val="clear"/>
-            <w:tcMar>
-              <w:top w:type="dxa" w:w="60"/>
-              <w:left w:type="dxa" w:w="110"/>
-              <w:bottom w:type="dxa" w:w="60"/>
-              <w:right w:type="dxa" w:w="110"/>
-            </w:tcMar>
-            <w:vAlign w:val="center"/>
-          </w:tcPr>
-          <w:p>
-            <w:r>
-              <w:rPr>
-                <w:b w:val="false"/>
-                <w:bCs w:val="false"/>
-                <w:sz w:val="19"/>
-                <w:szCs w:val="19"/>
-              </w:rPr>
-              <w:t xml:space="preserve">Listado de equipos.</w:t>
+            <w:tcW w:type="dxa" w:w="3360"/>
+            <w:shd w:fill="FFFFFF" w:val="clear"/>
+            <w:tcMar>
+              <w:top w:type="dxa" w:w="60"/>
+              <w:left w:type="dxa" w:w="110"/>
+              <w:bottom w:type="dxa" w:w="60"/>
+              <w:right w:type="dxa" w:w="110"/>
+            </w:tcMar>
+            <w:vAlign w:val="center"/>
+          </w:tcPr>
+          <w:p>
+            <w:r>
+              <w:rPr>
+                <w:b w:val="false"/>
+                <w:bCs w:val="false"/>
+                <w:sz w:val="19"/>
+                <w:szCs w:val="19"/>
+              </w:rPr>
+              <w:t xml:space="preserve">/api/categories</w:t>
+            </w:r>
+          </w:p>
+        </w:tc>
+        <w:tc>
+          <w:tcPr>
+            <w:tcW w:type="dxa" w:w="4900"/>
+            <w:shd w:fill="FFFFFF" w:val="clear"/>
+            <w:tcMar>
+              <w:top w:type="dxa" w:w="60"/>
+              <w:left w:type="dxa" w:w="110"/>
+              <w:bottom w:type="dxa" w:w="60"/>
+              <w:right w:type="dxa" w:w="110"/>
+            </w:tcMar>
+            <w:vAlign w:val="center"/>
+          </w:tcPr>
+          <w:p>
+            <w:r>
+              <w:rPr>
+                <w:b w:val="false"/>
+                <w:bCs w:val="false"/>
+                <w:sz w:val="19"/>
+                <w:szCs w:val="19"/>
+              </w:rPr>
+              <w:t xml:space="preserve">Listado de categorías.</w:t>
             </w:r>
           </w:p>
         </w:tc>
@@ -3121,7 +4016,7 @@
         </w:tc>
         <w:tc>
           <w:tcPr>
-            <w:tcW w:type="dxa" w:w="3260"/>
+            <w:tcW w:type="dxa" w:w="3360"/>
             <w:shd w:fill="F7F8FA" w:val="clear"/>
             <w:tcMar>
               <w:top w:type="dxa" w:w="60"/>
@@ -3139,13 +4034,13 @@
                 <w:sz w:val="19"/>
                 <w:szCs w:val="19"/>
               </w:rPr>
-              <w:t xml:space="preserve">/api/teams/:id</w:t>
-            </w:r>
-          </w:p>
-        </w:tc>
-        <w:tc>
-          <w:tcPr>
-            <w:tcW w:type="dxa" w:w="5000"/>
+              <w:t xml:space="preserve">/api/standings</w:t>
+            </w:r>
+          </w:p>
+        </w:tc>
+        <w:tc>
+          <w:tcPr>
+            <w:tcW w:type="dxa" w:w="4900"/>
             <w:shd w:fill="F7F8FA" w:val="clear"/>
             <w:tcMar>
               <w:top w:type="dxa" w:w="60"/>
@@ -3163,7 +4058,7 @@
                 <w:sz w:val="19"/>
                 <w:szCs w:val="19"/>
               </w:rPr>
-              <w:t xml:space="preserve">Detalle de un equipo (plantel, estadísticas y partidos).</w:t>
+              <w:t xml:space="preserve">Clasificación del torneo (season + category).</w:t>
             </w:r>
           </w:p>
         </w:tc>
@@ -3195,49 +4090,49 @@
         </w:tc>
         <w:tc>
           <w:tcPr>
-            <w:tcW w:type="dxa" w:w="3260"/>
-            <w:shd w:fill="FFFFFF" w:val="clear"/>
-            <w:tcMar>
-              <w:top w:type="dxa" w:w="60"/>
-              <w:left w:type="dxa" w:w="110"/>
-              <w:bottom w:type="dxa" w:w="60"/>
-              <w:right w:type="dxa" w:w="110"/>
-            </w:tcMar>
-            <w:vAlign w:val="center"/>
-          </w:tcPr>
-          <w:p>
-            <w:r>
-              <w:rPr>
-                <w:b w:val="false"/>
-                <w:bCs w:val="false"/>
-                <w:sz w:val="19"/>
-                <w:szCs w:val="19"/>
-              </w:rPr>
-              <w:t xml:space="preserve">/api/matches</w:t>
-            </w:r>
-          </w:p>
-        </w:tc>
-        <w:tc>
-          <w:tcPr>
-            <w:tcW w:type="dxa" w:w="5000"/>
-            <w:shd w:fill="FFFFFF" w:val="clear"/>
-            <w:tcMar>
-              <w:top w:type="dxa" w:w="60"/>
-              <w:left w:type="dxa" w:w="110"/>
-              <w:bottom w:type="dxa" w:w="60"/>
-              <w:right w:type="dxa" w:w="110"/>
-            </w:tcMar>
-            <w:vAlign w:val="center"/>
-          </w:tcPr>
-          <w:p>
-            <w:r>
-              <w:rPr>
-                <w:b w:val="false"/>
-                <w:bCs w:val="false"/>
-                <w:sz w:val="19"/>
-                <w:szCs w:val="19"/>
-              </w:rPr>
-              <w:t xml:space="preserve">Listado de partidos.</w:t>
+            <w:tcW w:type="dxa" w:w="3360"/>
+            <w:shd w:fill="FFFFFF" w:val="clear"/>
+            <w:tcMar>
+              <w:top w:type="dxa" w:w="60"/>
+              <w:left w:type="dxa" w:w="110"/>
+              <w:bottom w:type="dxa" w:w="60"/>
+              <w:right w:type="dxa" w:w="110"/>
+            </w:tcMar>
+            <w:vAlign w:val="center"/>
+          </w:tcPr>
+          <w:p>
+            <w:r>
+              <w:rPr>
+                <w:b w:val="false"/>
+                <w:bCs w:val="false"/>
+                <w:sz w:val="19"/>
+                <w:szCs w:val="19"/>
+              </w:rPr>
+              <w:t xml:space="preserve">/api/standings/champions</w:t>
+            </w:r>
+          </w:p>
+        </w:tc>
+        <w:tc>
+          <w:tcPr>
+            <w:tcW w:type="dxa" w:w="4900"/>
+            <w:shd w:fill="FFFFFF" w:val="clear"/>
+            <w:tcMar>
+              <w:top w:type="dxa" w:w="60"/>
+              <w:left w:type="dxa" w:w="110"/>
+              <w:bottom w:type="dxa" w:w="60"/>
+              <w:right w:type="dxa" w:w="110"/>
+            </w:tcMar>
+            <w:vAlign w:val="center"/>
+          </w:tcPr>
+          <w:p>
+            <w:r>
+              <w:rPr>
+                <w:b w:val="false"/>
+                <w:bCs w:val="false"/>
+                <w:sz w:val="19"/>
+                <w:szCs w:val="19"/>
+              </w:rPr>
+              <w:t xml:space="preserve">Históricos: campeones y palmarés.</w:t>
             </w:r>
           </w:p>
         </w:tc>
@@ -3269,7 +4164,7 @@
         </w:tc>
         <w:tc>
           <w:tcPr>
-            <w:tcW w:type="dxa" w:w="3260"/>
+            <w:tcW w:type="dxa" w:w="3360"/>
             <w:shd w:fill="F7F8FA" w:val="clear"/>
             <w:tcMar>
               <w:top w:type="dxa" w:w="60"/>
@@ -3287,13 +4182,13 @@
                 <w:sz w:val="19"/>
                 <w:szCs w:val="19"/>
               </w:rPr>
-              <w:t xml:space="preserve">/api/matches/calendar</w:t>
-            </w:r>
-          </w:p>
-        </w:tc>
-        <w:tc>
-          <w:tcPr>
-            <w:tcW w:type="dxa" w:w="5000"/>
+              <w:t xml:space="preserve">/api/teams</w:t>
+            </w:r>
+          </w:p>
+        </w:tc>
+        <w:tc>
+          <w:tcPr>
+            <w:tcW w:type="dxa" w:w="4900"/>
             <w:shd w:fill="F7F8FA" w:val="clear"/>
             <w:tcMar>
               <w:top w:type="dxa" w:w="60"/>
@@ -3311,7 +4206,7 @@
                 <w:sz w:val="19"/>
                 <w:szCs w:val="19"/>
               </w:rPr>
-              <w:t xml:space="preserve">Partidos programados (calendario).</w:t>
+              <w:t xml:space="preserve">Listado de equipos.</w:t>
             </w:r>
           </w:p>
         </w:tc>
@@ -3343,8 +4238,230 @@
         </w:tc>
         <w:tc>
           <w:tcPr>
-            <w:tcW w:type="dxa" w:w="3260"/>
-            <w:shd w:fill="FFFFFF" w:val="clear"/>
+            <w:tcW w:type="dxa" w:w="3360"/>
+            <w:shd w:fill="FFFFFF" w:val="clear"/>
+            <w:tcMar>
+              <w:top w:type="dxa" w:w="60"/>
+              <w:left w:type="dxa" w:w="110"/>
+              <w:bottom w:type="dxa" w:w="60"/>
+              <w:right w:type="dxa" w:w="110"/>
+            </w:tcMar>
+            <w:vAlign w:val="center"/>
+          </w:tcPr>
+          <w:p>
+            <w:r>
+              <w:rPr>
+                <w:b w:val="false"/>
+                <w:bCs w:val="false"/>
+                <w:sz w:val="19"/>
+                <w:szCs w:val="19"/>
+              </w:rPr>
+              <w:t xml:space="preserve">/api/teams/:id</w:t>
+            </w:r>
+          </w:p>
+        </w:tc>
+        <w:tc>
+          <w:tcPr>
+            <w:tcW w:type="dxa" w:w="4900"/>
+            <w:shd w:fill="FFFFFF" w:val="clear"/>
+            <w:tcMar>
+              <w:top w:type="dxa" w:w="60"/>
+              <w:left w:type="dxa" w:w="110"/>
+              <w:bottom w:type="dxa" w:w="60"/>
+              <w:right w:type="dxa" w:w="110"/>
+            </w:tcMar>
+            <w:vAlign w:val="center"/>
+          </w:tcPr>
+          <w:p>
+            <w:r>
+              <w:rPr>
+                <w:b w:val="false"/>
+                <w:bCs w:val="false"/>
+                <w:sz w:val="19"/>
+                <w:szCs w:val="19"/>
+              </w:rPr>
+              <w:t xml:space="preserve">Detalle de un equipo (plantel, estadísticas y partidos).</w:t>
+            </w:r>
+          </w:p>
+        </w:tc>
+      </w:tr>
+      <w:tr>
+        <w:tc>
+          <w:tcPr>
+            <w:tcW w:type="dxa" w:w="1100"/>
+            <w:shd w:fill="F7F8FA" w:val="clear"/>
+            <w:tcMar>
+              <w:top w:type="dxa" w:w="60"/>
+              <w:left w:type="dxa" w:w="110"/>
+              <w:bottom w:type="dxa" w:w="60"/>
+              <w:right w:type="dxa" w:w="110"/>
+            </w:tcMar>
+            <w:vAlign w:val="center"/>
+          </w:tcPr>
+          <w:p>
+            <w:r>
+              <w:rPr>
+                <w:b w:val="false"/>
+                <w:bCs w:val="false"/>
+                <w:sz w:val="19"/>
+                <w:szCs w:val="19"/>
+              </w:rPr>
+              <w:t xml:space="preserve">GET</w:t>
+            </w:r>
+          </w:p>
+        </w:tc>
+        <w:tc>
+          <w:tcPr>
+            <w:tcW w:type="dxa" w:w="3360"/>
+            <w:shd w:fill="F7F8FA" w:val="clear"/>
+            <w:tcMar>
+              <w:top w:type="dxa" w:w="60"/>
+              <w:left w:type="dxa" w:w="110"/>
+              <w:bottom w:type="dxa" w:w="60"/>
+              <w:right w:type="dxa" w:w="110"/>
+            </w:tcMar>
+            <w:vAlign w:val="center"/>
+          </w:tcPr>
+          <w:p>
+            <w:r>
+              <w:rPr>
+                <w:b w:val="false"/>
+                <w:bCs w:val="false"/>
+                <w:sz w:val="19"/>
+                <w:szCs w:val="19"/>
+              </w:rPr>
+              <w:t xml:space="preserve">/api/matches</w:t>
+            </w:r>
+          </w:p>
+        </w:tc>
+        <w:tc>
+          <w:tcPr>
+            <w:tcW w:type="dxa" w:w="4900"/>
+            <w:shd w:fill="F7F8FA" w:val="clear"/>
+            <w:tcMar>
+              <w:top w:type="dxa" w:w="60"/>
+              <w:left w:type="dxa" w:w="110"/>
+              <w:bottom w:type="dxa" w:w="60"/>
+              <w:right w:type="dxa" w:w="110"/>
+            </w:tcMar>
+            <w:vAlign w:val="center"/>
+          </w:tcPr>
+          <w:p>
+            <w:r>
+              <w:rPr>
+                <w:b w:val="false"/>
+                <w:bCs w:val="false"/>
+                <w:sz w:val="19"/>
+                <w:szCs w:val="19"/>
+              </w:rPr>
+              <w:t xml:space="preserve">Listado de partidos del torneo.</w:t>
+            </w:r>
+          </w:p>
+        </w:tc>
+      </w:tr>
+      <w:tr>
+        <w:tc>
+          <w:tcPr>
+            <w:tcW w:type="dxa" w:w="1100"/>
+            <w:shd w:fill="FFFFFF" w:val="clear"/>
+            <w:tcMar>
+              <w:top w:type="dxa" w:w="60"/>
+              <w:left w:type="dxa" w:w="110"/>
+              <w:bottom w:type="dxa" w:w="60"/>
+              <w:right w:type="dxa" w:w="110"/>
+            </w:tcMar>
+            <w:vAlign w:val="center"/>
+          </w:tcPr>
+          <w:p>
+            <w:r>
+              <w:rPr>
+                <w:b w:val="false"/>
+                <w:bCs w:val="false"/>
+                <w:sz w:val="19"/>
+                <w:szCs w:val="19"/>
+              </w:rPr>
+              <w:t xml:space="preserve">GET</w:t>
+            </w:r>
+          </w:p>
+        </w:tc>
+        <w:tc>
+          <w:tcPr>
+            <w:tcW w:type="dxa" w:w="3360"/>
+            <w:shd w:fill="FFFFFF" w:val="clear"/>
+            <w:tcMar>
+              <w:top w:type="dxa" w:w="60"/>
+              <w:left w:type="dxa" w:w="110"/>
+              <w:bottom w:type="dxa" w:w="60"/>
+              <w:right w:type="dxa" w:w="110"/>
+            </w:tcMar>
+            <w:vAlign w:val="center"/>
+          </w:tcPr>
+          <w:p>
+            <w:r>
+              <w:rPr>
+                <w:b w:val="false"/>
+                <w:bCs w:val="false"/>
+                <w:sz w:val="19"/>
+                <w:szCs w:val="19"/>
+              </w:rPr>
+              <w:t xml:space="preserve">/api/matches/calendar</w:t>
+            </w:r>
+          </w:p>
+        </w:tc>
+        <w:tc>
+          <w:tcPr>
+            <w:tcW w:type="dxa" w:w="4900"/>
+            <w:shd w:fill="FFFFFF" w:val="clear"/>
+            <w:tcMar>
+              <w:top w:type="dxa" w:w="60"/>
+              <w:left w:type="dxa" w:w="110"/>
+              <w:bottom w:type="dxa" w:w="60"/>
+              <w:right w:type="dxa" w:w="110"/>
+            </w:tcMar>
+            <w:vAlign w:val="center"/>
+          </w:tcPr>
+          <w:p>
+            <w:r>
+              <w:rPr>
+                <w:b w:val="false"/>
+                <w:bCs w:val="false"/>
+                <w:sz w:val="19"/>
+                <w:szCs w:val="19"/>
+              </w:rPr>
+              <w:t xml:space="preserve">Partidos programados (calendario).</w:t>
+            </w:r>
+          </w:p>
+        </w:tc>
+      </w:tr>
+      <w:tr>
+        <w:tc>
+          <w:tcPr>
+            <w:tcW w:type="dxa" w:w="1100"/>
+            <w:shd w:fill="F7F8FA" w:val="clear"/>
+            <w:tcMar>
+              <w:top w:type="dxa" w:w="60"/>
+              <w:left w:type="dxa" w:w="110"/>
+              <w:bottom w:type="dxa" w:w="60"/>
+              <w:right w:type="dxa" w:w="110"/>
+            </w:tcMar>
+            <w:vAlign w:val="center"/>
+          </w:tcPr>
+          <w:p>
+            <w:r>
+              <w:rPr>
+                <w:b w:val="false"/>
+                <w:bCs w:val="false"/>
+                <w:sz w:val="19"/>
+                <w:szCs w:val="19"/>
+              </w:rPr>
+              <w:t xml:space="preserve">GET</w:t>
+            </w:r>
+          </w:p>
+        </w:tc>
+        <w:tc>
+          <w:tcPr>
+            <w:tcW w:type="dxa" w:w="3360"/>
+            <w:shd w:fill="F7F8FA" w:val="clear"/>
             <w:tcMar>
               <w:top w:type="dxa" w:w="60"/>
               <w:left w:type="dxa" w:w="110"/>
@@ -3367,8 +4484,8 @@
         </w:tc>
         <w:tc>
           <w:tcPr>
-            <w:tcW w:type="dxa" w:w="5000"/>
-            <w:shd w:fill="FFFFFF" w:val="clear"/>
+            <w:tcW w:type="dxa" w:w="4900"/>
+            <w:shd w:fill="F7F8FA" w:val="clear"/>
             <w:tcMar>
               <w:top w:type="dxa" w:w="60"/>
               <w:left w:type="dxa" w:w="110"/>
@@ -3420,9 +4537,9 @@
         </w:tblBorders>
       </w:tblPr>
       <w:tblGrid>
-        <w:gridCol w:w="1100"/>
-        <w:gridCol w:w="3260"/>
-        <w:gridCol w:w="5000"/>
+        <w:gridCol w:w="2200"/>
+        <w:gridCol w:w="3200"/>
+        <w:gridCol w:w="3960"/>
       </w:tblGrid>
       <w:tr>
         <w:trPr>
@@ -3430,7 +4547,7 @@
         </w:trPr>
         <w:tc>
           <w:tcPr>
-            <w:tcW w:type="dxa" w:w="1100"/>
+            <w:tcW w:type="dxa" w:w="2200"/>
             <w:shd w:fill="14142B" w:val="clear"/>
             <w:tcMar>
               <w:top w:type="dxa" w:w="60"/>
@@ -3455,7 +4572,7 @@
         </w:tc>
         <w:tc>
           <w:tcPr>
-            <w:tcW w:type="dxa" w:w="3260"/>
+            <w:tcW w:type="dxa" w:w="3200"/>
             <w:shd w:fill="14142B" w:val="clear"/>
             <w:tcMar>
               <w:top w:type="dxa" w:w="60"/>
@@ -3480,7 +4597,7 @@
         </w:tc>
         <w:tc>
           <w:tcPr>
-            <w:tcW w:type="dxa" w:w="5000"/>
+            <w:tcW w:type="dxa" w:w="3960"/>
             <w:shd w:fill="14142B" w:val="clear"/>
             <w:tcMar>
               <w:top w:type="dxa" w:w="60"/>
@@ -3507,7 +4624,7 @@
       <w:tr>
         <w:tc>
           <w:tcPr>
-            <w:tcW w:type="dxa" w:w="1100"/>
+            <w:tcW w:type="dxa" w:w="2200"/>
             <w:shd w:fill="FFFFFF" w:val="clear"/>
             <w:tcMar>
               <w:top w:type="dxa" w:w="60"/>
@@ -3531,7 +4648,7 @@
         </w:tc>
         <w:tc>
           <w:tcPr>
-            <w:tcW w:type="dxa" w:w="3260"/>
+            <w:tcW w:type="dxa" w:w="3200"/>
             <w:shd w:fill="FFFFFF" w:val="clear"/>
             <w:tcMar>
               <w:top w:type="dxa" w:w="60"/>
@@ -3555,7 +4672,7 @@
         </w:tc>
         <w:tc>
           <w:tcPr>
-            <w:tcW w:type="dxa" w:w="5000"/>
+            <w:tcW w:type="dxa" w:w="3960"/>
             <w:shd w:fill="FFFFFF" w:val="clear"/>
             <w:tcMar>
               <w:top w:type="dxa" w:w="60"/>
@@ -3581,7 +4698,7 @@
       <w:tr>
         <w:tc>
           <w:tcPr>
-            <w:tcW w:type="dxa" w:w="1100"/>
+            <w:tcW w:type="dxa" w:w="2200"/>
             <w:shd w:fill="F7F8FA" w:val="clear"/>
             <w:tcMar>
               <w:top w:type="dxa" w:w="60"/>
@@ -3605,7 +4722,7 @@
         </w:tc>
         <w:tc>
           <w:tcPr>
-            <w:tcW w:type="dxa" w:w="3260"/>
+            <w:tcW w:type="dxa" w:w="3200"/>
             <w:shd w:fill="F7F8FA" w:val="clear"/>
             <w:tcMar>
               <w:top w:type="dxa" w:w="60"/>
@@ -3629,7 +4746,7 @@
         </w:tc>
         <w:tc>
           <w:tcPr>
-            <w:tcW w:type="dxa" w:w="5000"/>
+            <w:tcW w:type="dxa" w:w="3960"/>
             <w:shd w:fill="F7F8FA" w:val="clear"/>
             <w:tcMar>
               <w:top w:type="dxa" w:w="60"/>
@@ -3655,73 +4772,73 @@
       <w:tr>
         <w:tc>
           <w:tcPr>
-            <w:tcW w:type="dxa" w:w="1100"/>
-            <w:shd w:fill="FFFFFF" w:val="clear"/>
-            <w:tcMar>
-              <w:top w:type="dxa" w:w="60"/>
-              <w:left w:type="dxa" w:w="110"/>
-              <w:bottom w:type="dxa" w:w="60"/>
-              <w:right w:type="dxa" w:w="110"/>
-            </w:tcMar>
-            <w:vAlign w:val="center"/>
-          </w:tcPr>
-          <w:p>
-            <w:r>
-              <w:rPr>
-                <w:b w:val="false"/>
-                <w:bCs w:val="false"/>
-                <w:sz w:val="19"/>
-                <w:szCs w:val="19"/>
-              </w:rPr>
-              <w:t xml:space="preserve">POST</w:t>
-            </w:r>
-          </w:p>
-        </w:tc>
-        <w:tc>
-          <w:tcPr>
-            <w:tcW w:type="dxa" w:w="3260"/>
-            <w:shd w:fill="FFFFFF" w:val="clear"/>
-            <w:tcMar>
-              <w:top w:type="dxa" w:w="60"/>
-              <w:left w:type="dxa" w:w="110"/>
-              <w:bottom w:type="dxa" w:w="60"/>
-              <w:right w:type="dxa" w:w="110"/>
-            </w:tcMar>
-            <w:vAlign w:val="center"/>
-          </w:tcPr>
-          <w:p>
-            <w:r>
-              <w:rPr>
-                <w:b w:val="false"/>
-                <w:bCs w:val="false"/>
-                <w:sz w:val="19"/>
-                <w:szCs w:val="19"/>
-              </w:rPr>
-              <w:t xml:space="preserve">/api/teams</w:t>
-            </w:r>
-          </w:p>
-        </w:tc>
-        <w:tc>
-          <w:tcPr>
-            <w:tcW w:type="dxa" w:w="5000"/>
-            <w:shd w:fill="FFFFFF" w:val="clear"/>
-            <w:tcMar>
-              <w:top w:type="dxa" w:w="60"/>
-              <w:left w:type="dxa" w:w="110"/>
-              <w:bottom w:type="dxa" w:w="60"/>
-              <w:right w:type="dxa" w:w="110"/>
-            </w:tcMar>
-            <w:vAlign w:val="center"/>
-          </w:tcPr>
-          <w:p>
-            <w:r>
-              <w:rPr>
-                <w:b w:val="false"/>
-                <w:bCs w:val="false"/>
-                <w:sz w:val="19"/>
-                <w:szCs w:val="19"/>
-              </w:rPr>
-              <w:t xml:space="preserve">Crear equipo.</w:t>
+            <w:tcW w:type="dxa" w:w="2200"/>
+            <w:shd w:fill="FFFFFF" w:val="clear"/>
+            <w:tcMar>
+              <w:top w:type="dxa" w:w="60"/>
+              <w:left w:type="dxa" w:w="110"/>
+              <w:bottom w:type="dxa" w:w="60"/>
+              <w:right w:type="dxa" w:w="110"/>
+            </w:tcMar>
+            <w:vAlign w:val="center"/>
+          </w:tcPr>
+          <w:p>
+            <w:r>
+              <w:rPr>
+                <w:b w:val="false"/>
+                <w:bCs w:val="false"/>
+                <w:sz w:val="19"/>
+                <w:szCs w:val="19"/>
+              </w:rPr>
+              <w:t xml:space="preserve">POST · PUT · DELETE</w:t>
+            </w:r>
+          </w:p>
+        </w:tc>
+        <w:tc>
+          <w:tcPr>
+            <w:tcW w:type="dxa" w:w="3200"/>
+            <w:shd w:fill="FFFFFF" w:val="clear"/>
+            <w:tcMar>
+              <w:top w:type="dxa" w:w="60"/>
+              <w:left w:type="dxa" w:w="110"/>
+              <w:bottom w:type="dxa" w:w="60"/>
+              <w:right w:type="dxa" w:w="110"/>
+            </w:tcMar>
+            <w:vAlign w:val="center"/>
+          </w:tcPr>
+          <w:p>
+            <w:r>
+              <w:rPr>
+                <w:b w:val="false"/>
+                <w:bCs w:val="false"/>
+                <w:sz w:val="19"/>
+                <w:szCs w:val="19"/>
+              </w:rPr>
+              <w:t xml:space="preserve">/api/seasons</w:t>
+            </w:r>
+          </w:p>
+        </w:tc>
+        <w:tc>
+          <w:tcPr>
+            <w:tcW w:type="dxa" w:w="3960"/>
+            <w:shd w:fill="FFFFFF" w:val="clear"/>
+            <w:tcMar>
+              <w:top w:type="dxa" w:w="60"/>
+              <w:left w:type="dxa" w:w="110"/>
+              <w:bottom w:type="dxa" w:w="60"/>
+              <w:right w:type="dxa" w:w="110"/>
+            </w:tcMar>
+            <w:vAlign w:val="center"/>
+          </w:tcPr>
+          <w:p>
+            <w:r>
+              <w:rPr>
+                <w:b w:val="false"/>
+                <w:bCs w:val="false"/>
+                <w:sz w:val="19"/>
+                <w:szCs w:val="19"/>
+              </w:rPr>
+              <w:t xml:space="preserve">Crear, editar y eliminar temporadas.</w:t>
             </w:r>
           </w:p>
         </w:tc>
@@ -3729,7 +4846,7 @@
       <w:tr>
         <w:tc>
           <w:tcPr>
-            <w:tcW w:type="dxa" w:w="1100"/>
+            <w:tcW w:type="dxa" w:w="2200"/>
             <w:shd w:fill="F7F8FA" w:val="clear"/>
             <w:tcMar>
               <w:top w:type="dxa" w:w="60"/>
@@ -3747,13 +4864,13 @@
                 <w:sz w:val="19"/>
                 <w:szCs w:val="19"/>
               </w:rPr>
-              <w:t xml:space="preserve">PUT</w:t>
-            </w:r>
-          </w:p>
-        </w:tc>
-        <w:tc>
-          <w:tcPr>
-            <w:tcW w:type="dxa" w:w="3260"/>
+              <w:t xml:space="preserve">PATCH</w:t>
+            </w:r>
+          </w:p>
+        </w:tc>
+        <w:tc>
+          <w:tcPr>
+            <w:tcW w:type="dxa" w:w="3200"/>
             <w:shd w:fill="F7F8FA" w:val="clear"/>
             <w:tcMar>
               <w:top w:type="dxa" w:w="60"/>
@@ -3771,13 +4888,13 @@
                 <w:sz w:val="19"/>
                 <w:szCs w:val="19"/>
               </w:rPr>
-              <w:t xml:space="preserve">/api/teams/:id</w:t>
-            </w:r>
-          </w:p>
-        </w:tc>
-        <w:tc>
-          <w:tcPr>
-            <w:tcW w:type="dxa" w:w="5000"/>
+              <w:t xml:space="preserve">/api/seasons/:id/activate</w:t>
+            </w:r>
+          </w:p>
+        </w:tc>
+        <w:tc>
+          <w:tcPr>
+            <w:tcW w:type="dxa" w:w="3960"/>
             <w:shd w:fill="F7F8FA" w:val="clear"/>
             <w:tcMar>
               <w:top w:type="dxa" w:w="60"/>
@@ -3795,7 +4912,7 @@
                 <w:sz w:val="19"/>
                 <w:szCs w:val="19"/>
               </w:rPr>
-              <w:t xml:space="preserve">Editar equipo.</w:t>
+              <w:t xml:space="preserve">Marcar una temporada como activa.</w:t>
             </w:r>
           </w:p>
         </w:tc>
@@ -3803,73 +4920,73 @@
       <w:tr>
         <w:tc>
           <w:tcPr>
-            <w:tcW w:type="dxa" w:w="1100"/>
-            <w:shd w:fill="FFFFFF" w:val="clear"/>
-            <w:tcMar>
-              <w:top w:type="dxa" w:w="60"/>
-              <w:left w:type="dxa" w:w="110"/>
-              <w:bottom w:type="dxa" w:w="60"/>
-              <w:right w:type="dxa" w:w="110"/>
-            </w:tcMar>
-            <w:vAlign w:val="center"/>
-          </w:tcPr>
-          <w:p>
-            <w:r>
-              <w:rPr>
-                <w:b w:val="false"/>
-                <w:bCs w:val="false"/>
-                <w:sz w:val="19"/>
-                <w:szCs w:val="19"/>
-              </w:rPr>
-              <w:t xml:space="preserve">DELETE</w:t>
-            </w:r>
-          </w:p>
-        </w:tc>
-        <w:tc>
-          <w:tcPr>
-            <w:tcW w:type="dxa" w:w="3260"/>
-            <w:shd w:fill="FFFFFF" w:val="clear"/>
-            <w:tcMar>
-              <w:top w:type="dxa" w:w="60"/>
-              <w:left w:type="dxa" w:w="110"/>
-              <w:bottom w:type="dxa" w:w="60"/>
-              <w:right w:type="dxa" w:w="110"/>
-            </w:tcMar>
-            <w:vAlign w:val="center"/>
-          </w:tcPr>
-          <w:p>
-            <w:r>
-              <w:rPr>
-                <w:b w:val="false"/>
-                <w:bCs w:val="false"/>
-                <w:sz w:val="19"/>
-                <w:szCs w:val="19"/>
-              </w:rPr>
-              <w:t xml:space="preserve">/api/teams/:id</w:t>
-            </w:r>
-          </w:p>
-        </w:tc>
-        <w:tc>
-          <w:tcPr>
-            <w:tcW w:type="dxa" w:w="5000"/>
-            <w:shd w:fill="FFFFFF" w:val="clear"/>
-            <w:tcMar>
-              <w:top w:type="dxa" w:w="60"/>
-              <w:left w:type="dxa" w:w="110"/>
-              <w:bottom w:type="dxa" w:w="60"/>
-              <w:right w:type="dxa" w:w="110"/>
-            </w:tcMar>
-            <w:vAlign w:val="center"/>
-          </w:tcPr>
-          <w:p>
-            <w:r>
-              <w:rPr>
-                <w:b w:val="false"/>
-                <w:bCs w:val="false"/>
-                <w:sz w:val="19"/>
-                <w:szCs w:val="19"/>
-              </w:rPr>
-              <w:t xml:space="preserve">Eliminar equipo.</w:t>
+            <w:tcW w:type="dxa" w:w="2200"/>
+            <w:shd w:fill="FFFFFF" w:val="clear"/>
+            <w:tcMar>
+              <w:top w:type="dxa" w:w="60"/>
+              <w:left w:type="dxa" w:w="110"/>
+              <w:bottom w:type="dxa" w:w="60"/>
+              <w:right w:type="dxa" w:w="110"/>
+            </w:tcMar>
+            <w:vAlign w:val="center"/>
+          </w:tcPr>
+          <w:p>
+            <w:r>
+              <w:rPr>
+                <w:b w:val="false"/>
+                <w:bCs w:val="false"/>
+                <w:sz w:val="19"/>
+                <w:szCs w:val="19"/>
+              </w:rPr>
+              <w:t xml:space="preserve">POST · PUT · DELETE</w:t>
+            </w:r>
+          </w:p>
+        </w:tc>
+        <w:tc>
+          <w:tcPr>
+            <w:tcW w:type="dxa" w:w="3200"/>
+            <w:shd w:fill="FFFFFF" w:val="clear"/>
+            <w:tcMar>
+              <w:top w:type="dxa" w:w="60"/>
+              <w:left w:type="dxa" w:w="110"/>
+              <w:bottom w:type="dxa" w:w="60"/>
+              <w:right w:type="dxa" w:w="110"/>
+            </w:tcMar>
+            <w:vAlign w:val="center"/>
+          </w:tcPr>
+          <w:p>
+            <w:r>
+              <w:rPr>
+                <w:b w:val="false"/>
+                <w:bCs w:val="false"/>
+                <w:sz w:val="19"/>
+                <w:szCs w:val="19"/>
+              </w:rPr>
+              <w:t xml:space="preserve">/api/categories</w:t>
+            </w:r>
+          </w:p>
+        </w:tc>
+        <w:tc>
+          <w:tcPr>
+            <w:tcW w:type="dxa" w:w="3960"/>
+            <w:shd w:fill="FFFFFF" w:val="clear"/>
+            <w:tcMar>
+              <w:top w:type="dxa" w:w="60"/>
+              <w:left w:type="dxa" w:w="110"/>
+              <w:bottom w:type="dxa" w:w="60"/>
+              <w:right w:type="dxa" w:w="110"/>
+            </w:tcMar>
+            <w:vAlign w:val="center"/>
+          </w:tcPr>
+          <w:p>
+            <w:r>
+              <w:rPr>
+                <w:b w:val="false"/>
+                <w:bCs w:val="false"/>
+                <w:sz w:val="19"/>
+                <w:szCs w:val="19"/>
+              </w:rPr>
+              <w:t xml:space="preserve">Crear, editar y eliminar categorías.</w:t>
             </w:r>
           </w:p>
         </w:tc>
@@ -3877,7 +4994,7 @@
       <w:tr>
         <w:tc>
           <w:tcPr>
-            <w:tcW w:type="dxa" w:w="1100"/>
+            <w:tcW w:type="dxa" w:w="2200"/>
             <w:shd w:fill="F7F8FA" w:val="clear"/>
             <w:tcMar>
               <w:top w:type="dxa" w:w="60"/>
@@ -3895,13 +5012,13 @@
                 <w:sz w:val="19"/>
                 <w:szCs w:val="19"/>
               </w:rPr>
-              <w:t xml:space="preserve">POST</w:t>
-            </w:r>
-          </w:p>
-        </w:tc>
-        <w:tc>
-          <w:tcPr>
-            <w:tcW w:type="dxa" w:w="3260"/>
+              <w:t xml:space="preserve">POST · PUT · DELETE</w:t>
+            </w:r>
+          </w:p>
+        </w:tc>
+        <w:tc>
+          <w:tcPr>
+            <w:tcW w:type="dxa" w:w="3200"/>
             <w:shd w:fill="F7F8FA" w:val="clear"/>
             <w:tcMar>
               <w:top w:type="dxa" w:w="60"/>
@@ -3919,13 +5036,13 @@
                 <w:sz w:val="19"/>
                 <w:szCs w:val="19"/>
               </w:rPr>
-              <w:t xml:space="preserve">/api/players</w:t>
-            </w:r>
-          </w:p>
-        </w:tc>
-        <w:tc>
-          <w:tcPr>
-            <w:tcW w:type="dxa" w:w="5000"/>
+              <w:t xml:space="preserve">/api/teams</w:t>
+            </w:r>
+          </w:p>
+        </w:tc>
+        <w:tc>
+          <w:tcPr>
+            <w:tcW w:type="dxa" w:w="3960"/>
             <w:shd w:fill="F7F8FA" w:val="clear"/>
             <w:tcMar>
               <w:top w:type="dxa" w:w="60"/>
@@ -3943,7 +5060,7 @@
                 <w:sz w:val="19"/>
                 <w:szCs w:val="19"/>
               </w:rPr>
-              <w:t xml:space="preserve">Crear jugador.</w:t>
+              <w:t xml:space="preserve">Crear, editar y eliminar equipos.</w:t>
             </w:r>
           </w:p>
         </w:tc>
@@ -3951,73 +5068,73 @@
       <w:tr>
         <w:tc>
           <w:tcPr>
-            <w:tcW w:type="dxa" w:w="1100"/>
-            <w:shd w:fill="FFFFFF" w:val="clear"/>
-            <w:tcMar>
-              <w:top w:type="dxa" w:w="60"/>
-              <w:left w:type="dxa" w:w="110"/>
-              <w:bottom w:type="dxa" w:w="60"/>
-              <w:right w:type="dxa" w:w="110"/>
-            </w:tcMar>
-            <w:vAlign w:val="center"/>
-          </w:tcPr>
-          <w:p>
-            <w:r>
-              <w:rPr>
-                <w:b w:val="false"/>
-                <w:bCs w:val="false"/>
-                <w:sz w:val="19"/>
-                <w:szCs w:val="19"/>
-              </w:rPr>
-              <w:t xml:space="preserve">PUT</w:t>
-            </w:r>
-          </w:p>
-        </w:tc>
-        <w:tc>
-          <w:tcPr>
-            <w:tcW w:type="dxa" w:w="3260"/>
-            <w:shd w:fill="FFFFFF" w:val="clear"/>
-            <w:tcMar>
-              <w:top w:type="dxa" w:w="60"/>
-              <w:left w:type="dxa" w:w="110"/>
-              <w:bottom w:type="dxa" w:w="60"/>
-              <w:right w:type="dxa" w:w="110"/>
-            </w:tcMar>
-            <w:vAlign w:val="center"/>
-          </w:tcPr>
-          <w:p>
-            <w:r>
-              <w:rPr>
-                <w:b w:val="false"/>
-                <w:bCs w:val="false"/>
-                <w:sz w:val="19"/>
-                <w:szCs w:val="19"/>
-              </w:rPr>
-              <w:t xml:space="preserve">/api/players/:id</w:t>
-            </w:r>
-          </w:p>
-        </w:tc>
-        <w:tc>
-          <w:tcPr>
-            <w:tcW w:type="dxa" w:w="5000"/>
-            <w:shd w:fill="FFFFFF" w:val="clear"/>
-            <w:tcMar>
-              <w:top w:type="dxa" w:w="60"/>
-              <w:left w:type="dxa" w:w="110"/>
-              <w:bottom w:type="dxa" w:w="60"/>
-              <w:right w:type="dxa" w:w="110"/>
-            </w:tcMar>
-            <w:vAlign w:val="center"/>
-          </w:tcPr>
-          <w:p>
-            <w:r>
-              <w:rPr>
-                <w:b w:val="false"/>
-                <w:bCs w:val="false"/>
-                <w:sz w:val="19"/>
-                <w:szCs w:val="19"/>
-              </w:rPr>
-              <w:t xml:space="preserve">Editar jugador.</w:t>
+            <w:tcW w:type="dxa" w:w="2200"/>
+            <w:shd w:fill="FFFFFF" w:val="clear"/>
+            <w:tcMar>
+              <w:top w:type="dxa" w:w="60"/>
+              <w:left w:type="dxa" w:w="110"/>
+              <w:bottom w:type="dxa" w:w="60"/>
+              <w:right w:type="dxa" w:w="110"/>
+            </w:tcMar>
+            <w:vAlign w:val="center"/>
+          </w:tcPr>
+          <w:p>
+            <w:r>
+              <w:rPr>
+                <w:b w:val="false"/>
+                <w:bCs w:val="false"/>
+                <w:sz w:val="19"/>
+                <w:szCs w:val="19"/>
+              </w:rPr>
+              <w:t xml:space="preserve">POST · PUT · DELETE</w:t>
+            </w:r>
+          </w:p>
+        </w:tc>
+        <w:tc>
+          <w:tcPr>
+            <w:tcW w:type="dxa" w:w="3200"/>
+            <w:shd w:fill="FFFFFF" w:val="clear"/>
+            <w:tcMar>
+              <w:top w:type="dxa" w:w="60"/>
+              <w:left w:type="dxa" w:w="110"/>
+              <w:bottom w:type="dxa" w:w="60"/>
+              <w:right w:type="dxa" w:w="110"/>
+            </w:tcMar>
+            <w:vAlign w:val="center"/>
+          </w:tcPr>
+          <w:p>
+            <w:r>
+              <w:rPr>
+                <w:b w:val="false"/>
+                <w:bCs w:val="false"/>
+                <w:sz w:val="19"/>
+                <w:szCs w:val="19"/>
+              </w:rPr>
+              <w:t xml:space="preserve">/api/players</w:t>
+            </w:r>
+          </w:p>
+        </w:tc>
+        <w:tc>
+          <w:tcPr>
+            <w:tcW w:type="dxa" w:w="3960"/>
+            <w:shd w:fill="FFFFFF" w:val="clear"/>
+            <w:tcMar>
+              <w:top w:type="dxa" w:w="60"/>
+              <w:left w:type="dxa" w:w="110"/>
+              <w:bottom w:type="dxa" w:w="60"/>
+              <w:right w:type="dxa" w:w="110"/>
+            </w:tcMar>
+            <w:vAlign w:val="center"/>
+          </w:tcPr>
+          <w:p>
+            <w:r>
+              <w:rPr>
+                <w:b w:val="false"/>
+                <w:bCs w:val="false"/>
+                <w:sz w:val="19"/>
+                <w:szCs w:val="19"/>
+              </w:rPr>
+              <w:t xml:space="preserve">Crear, editar y eliminar jugadores.</w:t>
             </w:r>
           </w:p>
         </w:tc>
@@ -4025,7 +5142,7 @@
       <w:tr>
         <w:tc>
           <w:tcPr>
-            <w:tcW w:type="dxa" w:w="1100"/>
+            <w:tcW w:type="dxa" w:w="2200"/>
             <w:shd w:fill="F7F8FA" w:val="clear"/>
             <w:tcMar>
               <w:top w:type="dxa" w:w="60"/>
@@ -4043,13 +5160,13 @@
                 <w:sz w:val="19"/>
                 <w:szCs w:val="19"/>
               </w:rPr>
-              <w:t xml:space="preserve">DELETE</w:t>
-            </w:r>
-          </w:p>
-        </w:tc>
-        <w:tc>
-          <w:tcPr>
-            <w:tcW w:type="dxa" w:w="3260"/>
+              <w:t xml:space="preserve">POST · PUT · DELETE</w:t>
+            </w:r>
+          </w:p>
+        </w:tc>
+        <w:tc>
+          <w:tcPr>
+            <w:tcW w:type="dxa" w:w="3200"/>
             <w:shd w:fill="F7F8FA" w:val="clear"/>
             <w:tcMar>
               <w:top w:type="dxa" w:w="60"/>
@@ -4067,13 +5184,13 @@
                 <w:sz w:val="19"/>
                 <w:szCs w:val="19"/>
               </w:rPr>
-              <w:t xml:space="preserve">/api/players/:id</w:t>
-            </w:r>
-          </w:p>
-        </w:tc>
-        <w:tc>
-          <w:tcPr>
-            <w:tcW w:type="dxa" w:w="5000"/>
+              <w:t xml:space="preserve">/api/matches</w:t>
+            </w:r>
+          </w:p>
+        </w:tc>
+        <w:tc>
+          <w:tcPr>
+            <w:tcW w:type="dxa" w:w="3960"/>
             <w:shd w:fill="F7F8FA" w:val="clear"/>
             <w:tcMar>
               <w:top w:type="dxa" w:w="60"/>
@@ -4091,7 +5208,7 @@
                 <w:sz w:val="19"/>
                 <w:szCs w:val="19"/>
               </w:rPr>
-              <w:t xml:space="preserve">Eliminar jugador.</w:t>
+              <w:t xml:space="preserve">Crear, editar y eliminar partidos (requiere temporada y categoría).</w:t>
             </w:r>
           </w:p>
         </w:tc>
@@ -4099,155 +5216,7 @@
       <w:tr>
         <w:tc>
           <w:tcPr>
-            <w:tcW w:type="dxa" w:w="1100"/>
-            <w:shd w:fill="FFFFFF" w:val="clear"/>
-            <w:tcMar>
-              <w:top w:type="dxa" w:w="60"/>
-              <w:left w:type="dxa" w:w="110"/>
-              <w:bottom w:type="dxa" w:w="60"/>
-              <w:right w:type="dxa" w:w="110"/>
-            </w:tcMar>
-            <w:vAlign w:val="center"/>
-          </w:tcPr>
-          <w:p>
-            <w:r>
-              <w:rPr>
-                <w:b w:val="false"/>
-                <w:bCs w:val="false"/>
-                <w:sz w:val="19"/>
-                <w:szCs w:val="19"/>
-              </w:rPr>
-              <w:t xml:space="preserve">POST</w:t>
-            </w:r>
-          </w:p>
-        </w:tc>
-        <w:tc>
-          <w:tcPr>
-            <w:tcW w:type="dxa" w:w="3260"/>
-            <w:shd w:fill="FFFFFF" w:val="clear"/>
-            <w:tcMar>
-              <w:top w:type="dxa" w:w="60"/>
-              <w:left w:type="dxa" w:w="110"/>
-              <w:bottom w:type="dxa" w:w="60"/>
-              <w:right w:type="dxa" w:w="110"/>
-            </w:tcMar>
-            <w:vAlign w:val="center"/>
-          </w:tcPr>
-          <w:p>
-            <w:r>
-              <w:rPr>
-                <w:b w:val="false"/>
-                <w:bCs w:val="false"/>
-                <w:sz w:val="19"/>
-                <w:szCs w:val="19"/>
-              </w:rPr>
-              <w:t xml:space="preserve">/api/matches</w:t>
-            </w:r>
-          </w:p>
-        </w:tc>
-        <w:tc>
-          <w:tcPr>
-            <w:tcW w:type="dxa" w:w="5000"/>
-            <w:shd w:fill="FFFFFF" w:val="clear"/>
-            <w:tcMar>
-              <w:top w:type="dxa" w:w="60"/>
-              <w:left w:type="dxa" w:w="110"/>
-              <w:bottom w:type="dxa" w:w="60"/>
-              <w:right w:type="dxa" w:w="110"/>
-            </w:tcMar>
-            <w:vAlign w:val="center"/>
-          </w:tcPr>
-          <w:p>
-            <w:r>
-              <w:rPr>
-                <w:b w:val="false"/>
-                <w:bCs w:val="false"/>
-                <w:sz w:val="19"/>
-                <w:szCs w:val="19"/>
-              </w:rPr>
-              <w:t xml:space="preserve">Crear partido.</w:t>
-            </w:r>
-          </w:p>
-        </w:tc>
-      </w:tr>
-      <w:tr>
-        <w:tc>
-          <w:tcPr>
-            <w:tcW w:type="dxa" w:w="1100"/>
-            <w:shd w:fill="F7F8FA" w:val="clear"/>
-            <w:tcMar>
-              <w:top w:type="dxa" w:w="60"/>
-              <w:left w:type="dxa" w:w="110"/>
-              <w:bottom w:type="dxa" w:w="60"/>
-              <w:right w:type="dxa" w:w="110"/>
-            </w:tcMar>
-            <w:vAlign w:val="center"/>
-          </w:tcPr>
-          <w:p>
-            <w:r>
-              <w:rPr>
-                <w:b w:val="false"/>
-                <w:bCs w:val="false"/>
-                <w:sz w:val="19"/>
-                <w:szCs w:val="19"/>
-              </w:rPr>
-              <w:t xml:space="preserve">PUT</w:t>
-            </w:r>
-          </w:p>
-        </w:tc>
-        <w:tc>
-          <w:tcPr>
-            <w:tcW w:type="dxa" w:w="3260"/>
-            <w:shd w:fill="F7F8FA" w:val="clear"/>
-            <w:tcMar>
-              <w:top w:type="dxa" w:w="60"/>
-              <w:left w:type="dxa" w:w="110"/>
-              <w:bottom w:type="dxa" w:w="60"/>
-              <w:right w:type="dxa" w:w="110"/>
-            </w:tcMar>
-            <w:vAlign w:val="center"/>
-          </w:tcPr>
-          <w:p>
-            <w:r>
-              <w:rPr>
-                <w:b w:val="false"/>
-                <w:bCs w:val="false"/>
-                <w:sz w:val="19"/>
-                <w:szCs w:val="19"/>
-              </w:rPr>
-              <w:t xml:space="preserve">/api/matches/:id</w:t>
-            </w:r>
-          </w:p>
-        </w:tc>
-        <w:tc>
-          <w:tcPr>
-            <w:tcW w:type="dxa" w:w="5000"/>
-            <w:shd w:fill="F7F8FA" w:val="clear"/>
-            <w:tcMar>
-              <w:top w:type="dxa" w:w="60"/>
-              <w:left w:type="dxa" w:w="110"/>
-              <w:bottom w:type="dxa" w:w="60"/>
-              <w:right w:type="dxa" w:w="110"/>
-            </w:tcMar>
-            <w:vAlign w:val="center"/>
-          </w:tcPr>
-          <w:p>
-            <w:r>
-              <w:rPr>
-                <w:b w:val="false"/>
-                <w:bCs w:val="false"/>
-                <w:sz w:val="19"/>
-                <w:szCs w:val="19"/>
-              </w:rPr>
-              <w:t xml:space="preserve">Editar partido.</w:t>
-            </w:r>
-          </w:p>
-        </w:tc>
-      </w:tr>
-      <w:tr>
-        <w:tc>
-          <w:tcPr>
-            <w:tcW w:type="dxa" w:w="1100"/>
+            <w:tcW w:type="dxa" w:w="2200"/>
             <w:shd w:fill="FFFFFF" w:val="clear"/>
             <w:tcMar>
               <w:top w:type="dxa" w:w="60"/>
@@ -4271,7 +5240,7 @@
         </w:tc>
         <w:tc>
           <w:tcPr>
-            <w:tcW w:type="dxa" w:w="3260"/>
+            <w:tcW w:type="dxa" w:w="3200"/>
             <w:shd w:fill="FFFFFF" w:val="clear"/>
             <w:tcMar>
               <w:top w:type="dxa" w:w="60"/>
@@ -4295,99 +5264,25 @@
         </w:tc>
         <w:tc>
           <w:tcPr>
-            <w:tcW w:type="dxa" w:w="5000"/>
-            <w:shd w:fill="FFFFFF" w:val="clear"/>
-            <w:tcMar>
-              <w:top w:type="dxa" w:w="60"/>
-              <w:left w:type="dxa" w:w="110"/>
-              <w:bottom w:type="dxa" w:w="60"/>
-              <w:right w:type="dxa" w:w="110"/>
-            </w:tcMar>
-            <w:vAlign w:val="center"/>
-          </w:tcPr>
-          <w:p>
-            <w:r>
-              <w:rPr>
-                <w:b w:val="false"/>
-                <w:bCs w:val="false"/>
-                <w:sz w:val="19"/>
-                <w:szCs w:val="19"/>
-              </w:rPr>
-              <w:t xml:space="preserve">Cargar / editar resultado.</w:t>
-            </w:r>
-          </w:p>
-        </w:tc>
-      </w:tr>
-      <w:tr>
-        <w:tc>
-          <w:tcPr>
-            <w:tcW w:type="dxa" w:w="1100"/>
-            <w:shd w:fill="F7F8FA" w:val="clear"/>
-            <w:tcMar>
-              <w:top w:type="dxa" w:w="60"/>
-              <w:left w:type="dxa" w:w="110"/>
-              <w:bottom w:type="dxa" w:w="60"/>
-              <w:right w:type="dxa" w:w="110"/>
-            </w:tcMar>
-            <w:vAlign w:val="center"/>
-          </w:tcPr>
-          <w:p>
-            <w:r>
-              <w:rPr>
-                <w:b w:val="false"/>
-                <w:bCs w:val="false"/>
-                <w:sz w:val="19"/>
-                <w:szCs w:val="19"/>
-              </w:rPr>
-              <w:t xml:space="preserve">DELETE</w:t>
-            </w:r>
-          </w:p>
-        </w:tc>
-        <w:tc>
-          <w:tcPr>
-            <w:tcW w:type="dxa" w:w="3260"/>
-            <w:shd w:fill="F7F8FA" w:val="clear"/>
-            <w:tcMar>
-              <w:top w:type="dxa" w:w="60"/>
-              <w:left w:type="dxa" w:w="110"/>
-              <w:bottom w:type="dxa" w:w="60"/>
-              <w:right w:type="dxa" w:w="110"/>
-            </w:tcMar>
-            <w:vAlign w:val="center"/>
-          </w:tcPr>
-          <w:p>
-            <w:r>
-              <w:rPr>
-                <w:b w:val="false"/>
-                <w:bCs w:val="false"/>
-                <w:sz w:val="19"/>
-                <w:szCs w:val="19"/>
-              </w:rPr>
-              <w:t xml:space="preserve">/api/matches/:id</w:t>
-            </w:r>
-          </w:p>
-        </w:tc>
-        <w:tc>
-          <w:tcPr>
-            <w:tcW w:type="dxa" w:w="5000"/>
-            <w:shd w:fill="F7F8FA" w:val="clear"/>
-            <w:tcMar>
-              <w:top w:type="dxa" w:w="60"/>
-              <w:left w:type="dxa" w:w="110"/>
-              <w:bottom w:type="dxa" w:w="60"/>
-              <w:right w:type="dxa" w:w="110"/>
-            </w:tcMar>
-            <w:vAlign w:val="center"/>
-          </w:tcPr>
-          <w:p>
-            <w:r>
-              <w:rPr>
-                <w:b w:val="false"/>
-                <w:bCs w:val="false"/>
-                <w:sz w:val="19"/>
-                <w:szCs w:val="19"/>
-              </w:rPr>
-              <w:t xml:space="preserve">Eliminar partido.</w:t>
+            <w:tcW w:type="dxa" w:w="3960"/>
+            <w:shd w:fill="FFFFFF" w:val="clear"/>
+            <w:tcMar>
+              <w:top w:type="dxa" w:w="60"/>
+              <w:left w:type="dxa" w:w="110"/>
+              <w:bottom w:type="dxa" w:w="60"/>
+              <w:right w:type="dxa" w:w="110"/>
+            </w:tcMar>
+            <w:vAlign w:val="center"/>
+          </w:tcPr>
+          <w:p>
+            <w:r>
+              <w:rPr>
+                <w:b w:val="false"/>
+                <w:bCs w:val="false"/>
+                <w:sz w:val="19"/>
+                <w:szCs w:val="19"/>
+              </w:rPr>
+              <w:t xml:space="preserve">Cargar / editar el resultado.</w:t>
             </w:r>
           </w:p>
         </w:tc>
@@ -4398,7 +5293,15 @@
         <w:pStyle w:val="Heading1"/>
       </w:pPr>
       <w:r>
-        <w:t xml:space="preserve">7. Reglas de negocio: clasificación</w:t>
+        <w:t xml:space="preserve">7. Reglas de negocio</w:t>
+      </w:r>
+    </w:p>
+    <w:p>
+      <w:pPr>
+        <w:pStyle w:val="Heading2"/>
+      </w:pPr>
+      <w:r>
+        <w:t xml:space="preserve">7.1 Clasificación por torneo</w:t>
       </w:r>
     </w:p>
     <w:p>
@@ -4409,7 +5312,7 @@
         <w:rPr>
           <w:color w:val="2B2F3A"/>
         </w:rPr>
-        <w:t xml:space="preserve">La tabla de clasificación se calcula automáticamente a partir de los partidos jugados, aplicando el siguiente sistema de puntos:</w:t>
+        <w:t xml:space="preserve">Cada torneo (combinación de temporada y categoría) tiene su propia tabla, calculada automáticamente a partir de los partidos jugados de ese torneo, con el siguiente sistema de puntos:</w:t>
       </w:r>
     </w:p>
     <w:p>
@@ -4501,6 +5404,25 @@
     </w:p>
     <w:p>
       <w:pPr>
+        <w:pStyle w:val="Heading2"/>
+      </w:pPr>
+      <w:r>
+        <w:t xml:space="preserve">7.2 Históricos y palmarés</w:t>
+      </w:r>
+    </w:p>
+    <w:p>
+      <w:pPr>
+        <w:spacing w:after="160" w:line="276"/>
+      </w:pPr>
+      <w:r>
+        <w:rPr>
+          <w:color w:val="2B2F3A"/>
+        </w:rPr>
+        <w:t xml:space="preserve">La sección de históricos toma, para cada temporada y categoría con partidos jugados, al equipo que quedó en primer lugar. Con las temporadas ya cerradas se arma el palmarés: la cantidad de títulos obtenidos por cada equipo.</w:t>
+      </w:r>
+    </w:p>
+    <w:p>
+      <w:pPr>
         <w:pStyle w:val="Heading1"/>
       </w:pPr>
       <w:r>
@@ -4642,7 +5564,7 @@
         <w:rPr>
           <w:color w:val="2B2F3A"/>
         </w:rPr>
-        <w:t xml:space="preserve">Al iniciar por primera vez, el backend crea automáticamente el administrador definido en las variables de entorno.</w:t>
+        <w:t xml:space="preserve">Al iniciar por primera vez, el backend crea automáticamente el administrador definido en las variables de entorno. La carga de datos de ejemplo crea temporadas, categorías, equipos, jugadores y partidos.</w:t>
       </w:r>
     </w:p>
     <w:p>
@@ -4957,7 +5879,7 @@
                 <w:sz w:val="19"/>
                 <w:szCs w:val="19"/>
               </w:rPr>
-              <w:t xml:space="preserve">mongodb://127.0.0.1:27017/liga-baloncesto</w:t>
+              <w:t xml:space="preserve">mongodb+srv://...mongodb.net/liga</w:t>
             </w:r>
           </w:p>
         </w:tc>
@@ -5403,10 +6325,10 @@
     </w:tbl>
     <w:p>
       <w:pPr>
-        <w:pStyle w:val="Heading1"/>
-      </w:pPr>
-      <w:r>
-        <w:t xml:space="preserve">9. Credenciales de prueba</w:t>
+        <w:spacing w:after="120"/>
+      </w:pPr>
+      <w:r>
+        <w:t xml:space="preserve"/>
       </w:r>
     </w:p>
     <w:p>
@@ -5417,7 +6339,26 @@
         <w:rPr>
           <w:color w:val="2B2F3A"/>
         </w:rPr>
-        <w:t xml:space="preserve">Para acceder al área administrativa durante la evaluación se utilizan las siguientes credenciales (el administrador se crea automáticamente al iniciar el backend):</w:t>
+        <w:t xml:space="preserve">Nota: los archivos .env no se versionan (contienen datos sensibles). En cada equipo o PC nueva deben recrearse a partir de los ejemplos.</w:t>
+      </w:r>
+    </w:p>
+    <w:p>
+      <w:pPr>
+        <w:pStyle w:val="Heading1"/>
+      </w:pPr>
+      <w:r>
+        <w:t xml:space="preserve">9. Credenciales de prueba</w:t>
+      </w:r>
+    </w:p>
+    <w:p>
+      <w:pPr>
+        <w:spacing w:after="160" w:line="276"/>
+      </w:pPr>
+      <w:r>
+        <w:rPr>
+          <w:color w:val="2B2F3A"/>
+        </w:rPr>
+        <w:t xml:space="preserve">Para acceder al área administrativa se utilizan las siguientes credenciales (el administrador se crea automáticamente al iniciar el backend):</w:t>
       </w:r>
     </w:p>
     <w:tbl>
@@ -5639,7 +6580,7 @@
         <w:rPr>
           <w:color w:val="2B2F3A"/>
         </w:rPr>
-        <w:t xml:space="preserve">Cualquier visitante puede consultar la información de la liga sin iniciar sesión:</w:t>
+        <w:t xml:space="preserve">Cualquier visitante puede consultar la información sin iniciar sesión. En la parte superior, una barra permite elegir la temporada y la categoría (el torneo que se está viendo); el resto de la información se actualiza según esa selección:</w:t>
       </w:r>
     </w:p>
     <w:p>
@@ -5679,7 +6620,7 @@
         <w:t xml:space="preserve">Clasificación: </w:t>
       </w:r>
       <w:r>
-        <w:t xml:space="preserve">tabla de posiciones completa con todas las estadísticas.</w:t>
+        <w:t xml:space="preserve">tabla de posiciones del torneo elegido, con todas las estadísticas.</w:t>
       </w:r>
     </w:p>
     <w:p>
@@ -5696,10 +6637,10 @@
           <w:b/>
           <w:bCs/>
         </w:rPr>
-        <w:t xml:space="preserve">Calendario: </w:t>
-      </w:r>
-      <w:r>
-        <w:t xml:space="preserve">partidos programados con fecha, horario y sede.</w:t>
+        <w:t xml:space="preserve">Calendario / Resultados: </w:t>
+      </w:r>
+      <w:r>
+        <w:t xml:space="preserve">partidos programados y marcadores finales del torneo.</w:t>
       </w:r>
     </w:p>
     <w:p>
@@ -5716,10 +6657,10 @@
           <w:b/>
           <w:bCs/>
         </w:rPr>
-        <w:t xml:space="preserve">Resultados: </w:t>
-      </w:r>
-      <w:r>
-        <w:t xml:space="preserve">marcadores finales de los partidos jugados.</w:t>
+        <w:t xml:space="preserve">Equipos: </w:t>
+      </w:r>
+      <w:r>
+        <w:t xml:space="preserve">listado de clubes con su escudo; al ingresar a uno se ve su entrenador, plantel, estadísticas y partidos.</w:t>
       </w:r>
     </w:p>
     <w:p>
@@ -5736,10 +6677,10 @@
           <w:b/>
           <w:bCs/>
         </w:rPr>
-        <w:t xml:space="preserve">Equipos: </w:t>
-      </w:r>
-      <w:r>
-        <w:t xml:space="preserve">listado de clubes; al ingresar a uno se ve su entrenador, plantel, estadísticas y partidos (jugados y pendientes).</w:t>
+        <w:t xml:space="preserve">Históricos: </w:t>
+      </w:r>
+      <w:r>
+        <w:t xml:space="preserve">palmarés (títulos por equipo) y campeón de cada temporada y categoría.</w:t>
       </w:r>
     </w:p>
     <w:p>
@@ -5794,7 +6735,7 @@
         <w:pStyle w:val="Heading2"/>
       </w:pPr>
       <w:r>
-        <w:t xml:space="preserve">11.3 Gestión de equipos</w:t>
+        <w:t xml:space="preserve">11.3 Temporadas</w:t>
       </w:r>
     </w:p>
     <w:p>
@@ -5807,7 +6748,7 @@
         <w:spacing w:after="60"/>
       </w:pPr>
       <w:r>
-        <w:t xml:space="preserve">Crear: botón “Nuevo equipo”, completar nombre y entrenador y guardar.</w:t>
+        <w:t xml:space="preserve">Crear: botón “Nueva temporada”, indicar nombre y año; se puede marcar como activa.</w:t>
       </w:r>
     </w:p>
     <w:p>
@@ -5820,7 +6761,7 @@
         <w:spacing w:after="60"/>
       </w:pPr>
       <w:r>
-        <w:t xml:space="preserve">Editar: botón “Editar” en la fila del equipo.</w:t>
+        <w:t xml:space="preserve">Activar: botón “Activar” para elegir la temporada que se muestra por defecto.</w:t>
       </w:r>
     </w:p>
     <w:p>
@@ -5833,7 +6774,7 @@
         <w:spacing w:after="60"/>
       </w:pPr>
       <w:r>
-        <w:t xml:space="preserve">Eliminar: botón “Eliminar” (solo es posible si el equipo no tiene jugadores ni partidos asociados).</w:t>
+        <w:t xml:space="preserve">Editar / Eliminar (solo si no tiene partidos asociados).</w:t>
       </w:r>
     </w:p>
     <w:p>
@@ -5841,7 +6782,7 @@
         <w:pStyle w:val="Heading2"/>
       </w:pPr>
       <w:r>
-        <w:t xml:space="preserve">11.4 Gestión de jugadores</w:t>
+        <w:t xml:space="preserve">11.4 Categorías</w:t>
       </w:r>
     </w:p>
     <w:p>
@@ -5854,7 +6795,7 @@
         <w:spacing w:after="60"/>
       </w:pPr>
       <w:r>
-        <w:t xml:space="preserve">Crear: botón “Nuevo jugador”, completar nombre, apellido, categoría y equipo.</w:t>
+        <w:t xml:space="preserve">Crear: botón “Nueva categoría” (por ejemplo, U17). Cada categoría es un torneo aparte.</w:t>
       </w:r>
     </w:p>
     <w:p>
@@ -5867,7 +6808,7 @@
         <w:spacing w:after="60"/>
       </w:pPr>
       <w:r>
-        <w:t xml:space="preserve">Editar / Eliminar: acciones disponibles en cada fila de la tabla.</w:t>
+        <w:t xml:space="preserve">Editar / Eliminar (solo si no tiene jugadores ni partidos asociados).</w:t>
       </w:r>
     </w:p>
     <w:p>
@@ -5875,7 +6816,7 @@
         <w:pStyle w:val="Heading2"/>
       </w:pPr>
       <w:r>
-        <w:t xml:space="preserve">11.5 Gestión de partidos y resultados</w:t>
+        <w:t xml:space="preserve">11.5 Equipos</w:t>
       </w:r>
     </w:p>
     <w:p>
@@ -5888,7 +6829,7 @@
         <w:spacing w:after="60"/>
       </w:pPr>
       <w:r>
-        <w:t xml:space="preserve">Crear: botón “Nuevo partido”, seleccionar local y visitante e indicar fecha, hora y sede.</w:t>
+        <w:t xml:space="preserve">Crear: botón “Nuevo equipo”, completar nombre, entrenador y, opcionalmente, la URL del escudo.</w:t>
       </w:r>
     </w:p>
     <w:p>
@@ -5901,7 +6842,7 @@
         <w:spacing w:after="60"/>
       </w:pPr>
       <w:r>
-        <w:t xml:space="preserve">Cargar resultado: botón “Cargar resultado”, ingresar los puntos de cada equipo. El partido pasa a estado “jugado” y la clasificación se recalcula automáticamente.</w:t>
+        <w:t xml:space="preserve">Plantel: botón “Plantel” para ver y gestionar (agregar, editar, eliminar) los jugadores del equipo.</w:t>
       </w:r>
     </w:p>
     <w:p>
@@ -5914,7 +6855,7 @@
         <w:spacing w:after="60"/>
       </w:pPr>
       <w:r>
-        <w:t xml:space="preserve">Editar / Eliminar: acciones disponibles en cada partido.</w:t>
+        <w:t xml:space="preserve">Editar / Eliminar (solo si el equipo no tiene jugadores ni partidos asociados).</w:t>
       </w:r>
     </w:p>
     <w:p>
@@ -5922,26 +6863,7 @@
         <w:pStyle w:val="Heading2"/>
       </w:pPr>
       <w:r>
-        <w:t xml:space="preserve">11.6 Cierre de sesión</w:t>
-      </w:r>
-    </w:p>
-    <w:p>
-      <w:pPr>
-        <w:spacing w:after="160" w:line="276"/>
-      </w:pPr>
-      <w:r>
-        <w:rPr>
-          <w:color w:val="2B2F3A"/>
-        </w:rPr>
-        <w:t xml:space="preserve">El botón “Cerrar sesión” del panel finaliza la sesión y redirige al login. Las rutas administrativas dejan de estar accesibles hasta volver a autenticarse.</w:t>
-      </w:r>
-    </w:p>
-    <w:p>
-      <w:pPr>
-        <w:pStyle w:val="Heading1"/>
-      </w:pPr>
-      <w:r>
-        <w:t xml:space="preserve">12. Buenas prácticas y decisiones de diseño</w:t>
+        <w:t xml:space="preserve">11.6 Jugadores</w:t>
       </w:r>
     </w:p>
     <w:p>
@@ -5954,7 +6876,7 @@
         <w:spacing w:after="60"/>
       </w:pPr>
       <w:r>
-        <w:t xml:space="preserve">Código modular y reutilizable: capa de servicios, hooks y componentes compartidos evitan la duplicación.</w:t>
+        <w:t xml:space="preserve">Crear: botón “Nuevo jugador”, completar nombre, apellido, categoría y equipo.</w:t>
       </w:r>
     </w:p>
     <w:p>
@@ -5967,7 +6889,15 @@
         <w:spacing w:after="60"/>
       </w:pPr>
       <w:r>
-        <w:t xml:space="preserve">Separación de responsabilidades en el backend (routes/controllers/services/models).</w:t>
+        <w:t xml:space="preserve">Filtro por categoría y acciones de editar / eliminar en cada fila.</w:t>
+      </w:r>
+    </w:p>
+    <w:p>
+      <w:pPr>
+        <w:pStyle w:val="Heading2"/>
+      </w:pPr>
+      <w:r>
+        <w:t xml:space="preserve">11.7 Partidos y resultados</w:t>
       </w:r>
     </w:p>
     <w:p>
@@ -5980,7 +6910,7 @@
         <w:spacing w:after="60"/>
       </w:pPr>
       <w:r>
-        <w:t xml:space="preserve">Manejo centralizado de errores y mensajes claros para el usuario.</w:t>
+        <w:t xml:space="preserve">Crear: botón “Nuevo partido”, elegir temporada, categoría, equipos local y visitante, fecha, hora y sede.</w:t>
       </w:r>
     </w:p>
     <w:p>
@@ -5993,7 +6923,7 @@
         <w:spacing w:after="60"/>
       </w:pPr>
       <w:r>
-        <w:t xml:space="preserve">Diseño responsive con una identidad visual coherente con la temática deportiva.</w:t>
+        <w:t xml:space="preserve">Cargar resultado: botón “Cargar resultado”, ingresar los puntos de cada equipo. El partido pasa a “jugado” y la clasificación se recalcula automáticamente.</w:t>
       </w:r>
     </w:p>
     <w:p>
@@ -6006,7 +6936,26 @@
         <w:spacing w:after="60"/>
       </w:pPr>
       <w:r>
-        <w:t xml:space="preserve">Configuración por variables de entorno (sin credenciales ni URLs fijas en el código).</w:t>
+        <w:t xml:space="preserve">Editar / Eliminar disponibles en cada partido.</w:t>
+      </w:r>
+    </w:p>
+    <w:p>
+      <w:pPr>
+        <w:pStyle w:val="Heading2"/>
+      </w:pPr>
+      <w:r>
+        <w:t xml:space="preserve">11.8 Cierre de sesión</w:t>
+      </w:r>
+    </w:p>
+    <w:p>
+      <w:pPr>
+        <w:spacing w:after="160" w:line="276"/>
+      </w:pPr>
+      <w:r>
+        <w:rPr>
+          <w:color w:val="2B2F3A"/>
+        </w:rPr>
+        <w:t xml:space="preserve">El botón “Cerrar sesión” del panel finaliza la sesión y redirige al login. Las rutas administrativas dejan de estar accesibles hasta volver a autenticarse.</w:t>
       </w:r>
     </w:p>
     <w:p>
@@ -6014,7 +6963,7 @@
         <w:pStyle w:val="Heading1"/>
       </w:pPr>
       <w:r>
-        <w:t xml:space="preserve">13. Posibles mejoras futuras</w:t>
+        <w:t xml:space="preserve">12. Buenas prácticas y decisiones de diseño</w:t>
       </w:r>
     </w:p>
     <w:p>
@@ -6027,7 +6976,7 @@
         <w:spacing w:after="60"/>
       </w:pPr>
       <w:r>
-        <w:t xml:space="preserve">Estadísticas individuales por jugador (puntos, partidos disputados).</w:t>
+        <w:t xml:space="preserve">Código modular y reutilizable: capa de servicios, hooks y componentes compartidos evitan la duplicación.</w:t>
       </w:r>
     </w:p>
     <w:p>
@@ -6040,7 +6989,7 @@
         <w:spacing w:after="60"/>
       </w:pPr>
       <w:r>
-        <w:t xml:space="preserve">Gestión de múltiples temporadas o categorías en paralelo.</w:t>
+        <w:t xml:space="preserve">Separación de responsabilidades en el backend (routes/controllers/services/models).</w:t>
       </w:r>
     </w:p>
     <w:p>
@@ -6053,7 +7002,7 @@
         <w:spacing w:after="60"/>
       </w:pPr>
       <w:r>
-        <w:t xml:space="preserve">Paginación y búsqueda en los listados administrativos.</w:t>
+        <w:t xml:space="preserve">Manejo centralizado de errores y mensajes claros para el usuario.</w:t>
       </w:r>
     </w:p>
     <w:p>
@@ -6066,7 +7015,80 @@
         <w:spacing w:after="60"/>
       </w:pPr>
       <w:r>
+        <w:t xml:space="preserve">Diseño responsive con una identidad visual coherente con la temática deportiva.</w:t>
+      </w:r>
+    </w:p>
+    <w:p>
+      <w:pPr>
+        <w:pStyle w:val="ListParagraph"/>
+        <w:numPr>
+          <w:ilvl w:val="0"/>
+          <w:numId w:val="2"/>
+        </w:numPr>
+        <w:spacing w:after="60"/>
+      </w:pPr>
+      <w:r>
+        <w:t xml:space="preserve">Configuración por variables de entorno (sin credenciales ni URLs fijas en el código).</w:t>
+      </w:r>
+    </w:p>
+    <w:p>
+      <w:pPr>
+        <w:pStyle w:val="Heading1"/>
+      </w:pPr>
+      <w:r>
+        <w:t xml:space="preserve">13. Posibles mejoras futuras</w:t>
+      </w:r>
+    </w:p>
+    <w:p>
+      <w:pPr>
+        <w:pStyle w:val="ListParagraph"/>
+        <w:numPr>
+          <w:ilvl w:val="0"/>
+          <w:numId w:val="2"/>
+        </w:numPr>
+        <w:spacing w:after="60"/>
+      </w:pPr>
+      <w:r>
+        <w:t xml:space="preserve">Estadísticas individuales por jugador (puntos por partido y máximos anotadores).</w:t>
+      </w:r>
+    </w:p>
+    <w:p>
+      <w:pPr>
+        <w:pStyle w:val="ListParagraph"/>
+        <w:numPr>
+          <w:ilvl w:val="0"/>
+          <w:numId w:val="2"/>
+        </w:numPr>
+        <w:spacing w:after="60"/>
+      </w:pPr>
+      <w:r>
+        <w:t xml:space="preserve">Paginación y búsqueda en los listados administrativos.</w:t>
+      </w:r>
+    </w:p>
+    <w:p>
+      <w:pPr>
+        <w:pStyle w:val="ListParagraph"/>
+        <w:numPr>
+          <w:ilvl w:val="0"/>
+          <w:numId w:val="2"/>
+        </w:numPr>
+        <w:spacing w:after="60"/>
+      </w:pPr>
+      <w:r>
         <w:t xml:space="preserve">Despliegue en la nube (frontend y backend) con base MongoDB Atlas.</w:t>
+      </w:r>
+    </w:p>
+    <w:p>
+      <w:pPr>
+        <w:pStyle w:val="ListParagraph"/>
+        <w:numPr>
+          <w:ilvl w:val="0"/>
+          <w:numId w:val="2"/>
+        </w:numPr>
+        <w:spacing w:after="60"/>
+      </w:pPr>
+      <w:r>
+        <w:t xml:space="preserve">Carga de escudos por archivo (en lugar de URL).</w:t>
       </w:r>
     </w:p>
     <w:sectPr>

</xml_diff>

<commit_message>
docs: update deployment and demo credentials
</commit_message>
<xml_diff>
--- a/docs/Documentacion-TPO-Liga-Baloncesto.docx
+++ b/docs/Documentacion-TPO-Liga-Baloncesto.docx
@@ -643,6 +643,25 @@
         <w:t xml:space="preserve">esquemas de datos de Mongoose (Equipo, Jugador, Partido, Temporada, Categoría, Admin).</w:t>
       </w:r>
     </w:p>
+    <w:p/>
+    <w:p>
+      <w:r>
+        <w:rPr>
+          <w:b/>
+        </w:rPr>
+        <w:t>Despliegue actual</w:t>
+      </w:r>
+    </w:p>
+    <w:p>
+      <w:r>
+        <w:t>La version publicada de la aplicacion utiliza MongoDB Atlas como base de datos en la nube y Render para el despliegue: un Web Service para el backend Node/Express y un Static Site para el frontend React/Vite.</w:t>
+      </w:r>
+    </w:p>
+    <w:p>
+      <w:r>
+        <w:t>URLs de produccion: frontend https://tpo-aplicaciones-interactivas-1-ctwa.onrender.com y backend https://tpo-aplicaciones-interactivas-w5d4.onrender.com. El healthcheck del backend se verifica en /api/health.</w:t>
+      </w:r>
+    </w:p>
     <w:p>
       <w:pPr>
         <w:pStyle w:val="Heading1"/>
@@ -1668,7 +1687,7 @@
                 <w:b w:val="false"/>
                 <w:bCs w:val="false"/>
               </w:rPr>
-              <w:t xml:space="preserve">admin1234</w:t>
+              <w:t>Admin1234</w:t>
             </w:r>
           </w:p>
         </w:tc>
@@ -1971,7 +1990,7 @@
                 <w:b w:val="false"/>
                 <w:bCs w:val="false"/>
               </w:rPr>
-              <w:t xml:space="preserve">admin1234</w:t>
+              <w:t>Admin1234</w:t>
             </w:r>
           </w:p>
         </w:tc>
@@ -2367,7 +2386,7 @@
         <w:t xml:space="preserve">Datos de demostración: </w:t>
       </w:r>
       <w:r>
-        <w:t xml:space="preserve">12 clubes con escudo, planteles y un fixture todos-contra-todos por jornadas (cada equipo juega una sola vez por fecha).</w:t>
+        <w:t>12 clubes con escudo, 378 jugadores, planteles y un fixture todos-contra-todos por jornadas (cada equipo juega una sola vez por fecha).</w:t>
       </w:r>
     </w:p>
     <w:p>

</xml_diff>